<commit_message>
CF-247: v2.15.276 institution type (Decision 258); System reference 1.11; handover Version 2 reissued
Co-Authored-By: Claude Opus 5.5 <noreply@anthropic.com>
Claude-Session: https://claude.ai/code/session_01XEktdbAh5nkn5fvjobpL1o
</commit_message>
<xml_diff>
--- a/docs/integrations/coursefinder-wix-api-handover-v2.docx
+++ b/docs/integrations/coursefinder-wix-api-handover-v2.docx
@@ -796,6 +796,95 @@
           <w:rtl w:val="0"/>
         </w:rPr>
         <w:t xml:space="preserve"> detail, by study level.</w:t>
+      </w:r>
+    </w:p>
+    <w:p>
+      <w:pPr>
+        <w:numPr>
+          <w:ilvl w:val="0"/>
+          <w:numId w:val="1"/>
+        </w:numPr>
+        <w:spacing w:after="0" w:before="0" w:line="276" w:lineRule="auto"/>
+        <w:ind w:left="360" w:right="0" w:hanging="360"/>
+        <w:jc w:val="left"/>
+      </w:pPr>
+      <w:r>
+        <w:rPr>
+          <w:b w:val="1"/>
+          <w:bCs w:val="1"/>
+          <w:rtl w:val="0"/>
+        </w:rPr>
+        <w:t xml:space="preserve">Institution type</w:t>
+      </w:r>
+      <w:r>
+        <w:rPr>
+          <w:rtl w:val="0"/>
+        </w:rPr>
+        <w:t xml:space="preserve"> (University, University College, Higher Education Institute, TAFE / Polytechnic, Private VET college, School, Wānanga, Other) is returned on every provider and on the provider of every course, with the </w:t>
+      </w:r>
+      <w:r>
+        <w:rPr>
+          <w:rFonts w:ascii="Consolas" w:cs="Consolas" w:eastAsia="Consolas" w:hAnsi="Consolas"/>
+          <w:color w:val="000000"/>
+          <w:sz w:val="17"/>
+          <w:szCs w:val="17"/>
+          <w:rtl w:val="0"/>
+        </w:rPr>
+        <w:t xml:space="preserve">institution_types</w:t>
+      </w:r>
+      <w:r>
+        <w:rPr>
+          <w:rtl w:val="0"/>
+        </w:rPr>
+        <w:t xml:space="preserve"> filter on </w:t>
+      </w:r>
+      <w:r>
+        <w:rPr>
+          <w:rFonts w:ascii="Consolas" w:cs="Consolas" w:eastAsia="Consolas" w:hAnsi="Consolas"/>
+          <w:color w:val="000000"/>
+          <w:sz w:val="17"/>
+          <w:szCs w:val="17"/>
+          <w:rtl w:val="0"/>
+        </w:rPr>
+        <w:t xml:space="preserve">search</w:t>
+      </w:r>
+      <w:r>
+        <w:rPr>
+          <w:rtl w:val="0"/>
+        </w:rPr>
+        <w:t xml:space="preserve"> and </w:t>
+      </w:r>
+      <w:r>
+        <w:rPr>
+          <w:rFonts w:ascii="Consolas" w:cs="Consolas" w:eastAsia="Consolas" w:hAnsi="Consolas"/>
+          <w:color w:val="000000"/>
+          <w:sz w:val="17"/>
+          <w:szCs w:val="17"/>
+          <w:rtl w:val="0"/>
+        </w:rPr>
+        <w:t xml:space="preserve">providers</w:t>
+      </w:r>
+      <w:r>
+        <w:rPr>
+          <w:rtl w:val="0"/>
+        </w:rPr>
+        <w:t xml:space="preserve"> and the list in </w:t>
+      </w:r>
+      <w:r>
+        <w:rPr>
+          <w:rFonts w:ascii="Consolas" w:cs="Consolas" w:eastAsia="Consolas" w:hAnsi="Consolas"/>
+          <w:color w:val="000000"/>
+          <w:sz w:val="17"/>
+          <w:szCs w:val="17"/>
+          <w:rtl w:val="0"/>
+        </w:rPr>
+        <w:t xml:space="preserve">reference</w:t>
+      </w:r>
+      <w:r>
+        <w:rPr>
+          <w:rtl w:val="0"/>
+        </w:rPr>
+        <w:t xml:space="preserve">. Australia and New Zealand are typed from the regulators' registers; Canada is not typed yet (null).</w:t>
       </w:r>
     </w:p>
     <w:p>
@@ -3959,7 +4048,7 @@
         <w:rPr>
           <w:rtl w:val="0"/>
         </w:rPr>
-        <w:t xml:space="preserve"> and cache the vocabularies per country: study levels, study areas, subdivisions, cities and metro areas, intake months, English tests, regional categories, university groups, scholarship amount types and study stages, each with counts. Recommended refresh: once daily.</w:t>
+        <w:t xml:space="preserve"> and cache the vocabularies per country: study levels, study areas, subdivisions, cities and metro areas, intake months, English tests, regional categories, university groups, institution types, scholarship amount types and study stages, each with counts. Recommended refresh: once daily.</w:t>
       </w:r>
     </w:p>
     <w:p>
@@ -7104,6 +7193,57 @@
               <w:rPr>
                 <w:rtl w:val="0"/>
               </w:rPr>
+              <w:t xml:space="preserve">institution_types</w:t>
+            </w:r>
+          </w:p>
+        </w:tc>
+        <w:tc>
+          <w:tcPr>
+            <w:tcW w:w="1700" w:type="dxa"/>
+            <w:vAlign w:val="center"/>
+          </w:tcPr>
+          <w:p>
+            <w:pPr/>
+            <w:r>
+              <w:rPr>
+                <w:rtl w:val="0"/>
+              </w:rPr>
+              <w:t xml:space="preserve">string[]</w:t>
+            </w:r>
+          </w:p>
+        </w:tc>
+        <w:tc>
+          <w:tcPr>
+            <w:tcW w:w="5124" w:type="dxa"/>
+            <w:vAlign w:val="center"/>
+          </w:tcPr>
+          <w:p>
+            <w:pPr/>
+            <w:r>
+              <w:rPr>
+                <w:rtl w:val="0"/>
+              </w:rPr>
+              <w:t xml:space="preserve">Institution type codes from reference: university, university_college, higher_education_institute, tafe_polytechnic, private_vet, school, wananga, other. A course matches through its provider</w:t>
+            </w:r>
+          </w:p>
+        </w:tc>
+      </w:tr>
+      <w:tr>
+        <w:trPr>
+          <w:cantSplit w:val="1"/>
+          <w:tblHeader w:val="0"/>
+        </w:trPr>
+        <w:tc>
+          <w:tcPr>
+            <w:tcW w:w="3400" w:type="dxa"/>
+            <w:vAlign w:val="center"/>
+          </w:tcPr>
+          <w:p>
+            <w:pPr/>
+            <w:r>
+              <w:rPr>
+                <w:rtl w:val="0"/>
+              </w:rPr>
               <w:t xml:space="preserve">delivery_modes</w:t>
             </w:r>
           </w:p>
@@ -7822,7 +7962,7 @@
               <w:rPr>
                 <w:rtl w:val="0"/>
               </w:rPr>
-              <w:t xml:space="preserve">provider { provider_id, name, legal_name, university_groups[], ranking_summary, logo }</w:t>
+              <w:t xml:space="preserve">provider { provider_id, name, legal_name, institution_type, university_groups[], ranking_summary, logo }</w:t>
             </w:r>
           </w:p>
         </w:tc>
@@ -7852,7 +7992,7 @@
               <w:rPr>
                 <w:rtl w:val="0"/>
               </w:rPr>
-              <w:t xml:space="preserve">Presentable name; legal name kept; ranking_summary and logo as in 13.4</w:t>
+              <w:t xml:space="preserve">Presentable name; legal name kept; institution_type, ranking_summary and logo as in 13.4</w:t>
             </w:r>
           </w:p>
         </w:tc>
@@ -9026,7 +9166,7 @@
         <w:rPr>
           <w:rtl w:val="0"/>
         </w:rPr>
-        <w:t xml:space="preserve">Filters: keyword, country_codes, subdivision_codes, cities, regional_categories, university_groups, study_level_codes (offered), study_area_codes (offered), has_scholarship, ranked_in (qs_wur, the_wur), qs_rank_max, the_rank_max, has_logo, provider_ids. Sort: name_asc (default), qs_rank_asc, the_rank_asc, course_count_desc. Detail (</w:t>
+        <w:t xml:space="preserve">Filters: keyword, country_codes, subdivision_codes, cities, regional_categories, university_groups, study_level_codes (offered), study_area_codes (offered), has_scholarship, ranked_in (qs_wur, the_wur), qs_rank_max, the_rank_max, has_logo, provider_ids, institution_types. Sort: name_asc (default), qs_rank_asc, the_rank_asc, course_count_desc. Detail (</w:t>
       </w:r>
       <w:r>
         <w:rPr>
@@ -9166,6 +9306,81 @@
           </w:tcPr>
           <w:p>
             <w:pPr/>
+          </w:p>
+        </w:tc>
+      </w:tr>
+      <w:tr>
+        <w:trPr>
+          <w:cantSplit w:val="1"/>
+          <w:tblHeader w:val="0"/>
+        </w:trPr>
+        <w:tc>
+          <w:tcPr>
+            <w:tcW w:w="4300" w:type="dxa"/>
+            <w:vAlign w:val="center"/>
+          </w:tcPr>
+          <w:p>
+            <w:pPr/>
+            <w:r>
+              <w:rPr>
+                <w:rtl w:val="0"/>
+              </w:rPr>
+              <w:t xml:space="preserve">institution_type { code, name, basis }</w:t>
+            </w:r>
+          </w:p>
+        </w:tc>
+        <w:tc>
+          <w:tcPr>
+            <w:tcW w:w="1300" w:type="dxa"/>
+            <w:vAlign w:val="center"/>
+          </w:tcPr>
+          <w:p>
+            <w:pPr/>
+            <w:r>
+              <w:rPr>
+                <w:rtl w:val="0"/>
+              </w:rPr>
+              <w:t xml:space="preserve">list</w:t>
+            </w:r>
+          </w:p>
+        </w:tc>
+        <w:tc>
+          <w:tcPr>
+            <w:tcW w:w="4624" w:type="dxa"/>
+            <w:vAlign w:val="center"/>
+          </w:tcPr>
+          <w:p>
+            <w:pPr/>
+            <w:r>
+              <w:rPr>
+                <w:b w:val="1"/>
+                <w:bCs w:val="1"/>
+                <w:rtl w:val="0"/>
+              </w:rPr>
+              <w:t xml:space="preserve">Added 14 Oct.</w:t>
+            </w:r>
+            <w:r>
+              <w:rPr>
+                <w:rtl w:val="0"/>
+              </w:rPr>
+              <w:t xml:space="preserve"> The type from the regulators' registers: Australia from the TEQSA National Register (university, university college, institute of higher education) and the CRICOS institution type with the provider's courses (a government provider offering VET is TAFE); New Zealand from the NZQA organisation type. </w:t>
+            </w:r>
+            <w:r>
+              <w:rPr>
+                <w:rFonts w:ascii="Consolas" w:cs="Consolas" w:eastAsia="Consolas" w:hAnsi="Consolas"/>
+                <w:color w:val="000000"/>
+                <w:sz w:val="17"/>
+                <w:szCs w:val="17"/>
+                <w:rtl w:val="0"/>
+              </w:rPr>
+              <w:t xml:space="preserve">basis</w:t>
+            </w:r>
+            <w:r>
+              <w:rPr>
+                <w:rtl w:val="0"/>
+              </w:rPr>
+              <w:t xml:space="preserve"> names the rule, or reads Set by a person. null when not held (Canada; a few Australian providers no rule fits)</w:t>
+            </w:r>
           </w:p>
         </w:tc>
       </w:tr>
@@ -13015,6 +13230,703 @@
         <w:spacing w:after="0" w:before="0"/>
       </w:pPr>
     </w:p>
+    <w:tbl>
+      <w:tblPr>
+        <w:tblStyle w:val="Table1"/>
+        <w:tblW w:w="10224" w:type="dxa"/>
+        <w:jc w:val="left"/>
+        <w:tblInd w:w="-108" w:type="dxa"/>
+        <w:tblBorders>
+          <w:top w:color="000000" w:space="0" w:sz="4" w:val="single"/>
+          <w:left w:color="000000" w:space="0" w:sz="4" w:val="single"/>
+          <w:bottom w:color="000000" w:space="0" w:sz="4" w:val="single"/>
+          <w:right w:color="000000" w:space="0" w:sz="4" w:val="single"/>
+          <w:insideH w:color="000000" w:space="0" w:sz="4" w:val="single"/>
+          <w:insideV w:color="000000" w:space="0" w:sz="4" w:val="single"/>
+        </w:tblBorders>
+        <w:tblLayout w:type="fixed"/>
+        <w:tblLook w:val="0400"/>
+      </w:tblPr>
+      <w:tblGrid>
+        <w:gridCol w:w="3324"/>
+        <w:gridCol w:w="2300"/>
+        <w:gridCol w:w="2300"/>
+        <w:gridCol w:w="2300"/>
+      </w:tblGrid>
+      <w:tr>
+        <w:trPr>
+          <w:cantSplit w:val="1"/>
+          <w:tblHeader w:val="1"/>
+        </w:trPr>
+        <w:tc>
+          <w:tcPr>
+            <w:tcW w:w="3324" w:type="dxa"/>
+            <w:vAlign w:val="center"/>
+          </w:tcPr>
+          <w:p>
+            <w:pPr/>
+            <w:r>
+              <w:rPr>
+                <w:b w:val="1"/>
+                <w:bCs w:val="1"/>
+                <w:rtl w:val="0"/>
+              </w:rPr>
+              <w:t xml:space="preserve">Institution type (providers with courses)</w:t>
+            </w:r>
+          </w:p>
+        </w:tc>
+        <w:tc>
+          <w:tcPr>
+            <w:tcW w:w="2300" w:type="dxa"/>
+            <w:vAlign w:val="center"/>
+          </w:tcPr>
+          <w:p>
+            <w:pPr/>
+            <w:r>
+              <w:rPr>
+                <w:b w:val="1"/>
+                <w:bCs w:val="1"/>
+                <w:rtl w:val="0"/>
+              </w:rPr>
+              <w:t xml:space="preserve">Australia</w:t>
+            </w:r>
+          </w:p>
+        </w:tc>
+        <w:tc>
+          <w:tcPr>
+            <w:tcW w:w="2300" w:type="dxa"/>
+            <w:vAlign w:val="center"/>
+          </w:tcPr>
+          <w:p>
+            <w:pPr/>
+            <w:r>
+              <w:rPr>
+                <w:b w:val="1"/>
+                <w:bCs w:val="1"/>
+                <w:rtl w:val="0"/>
+              </w:rPr>
+              <w:t xml:space="preserve">New Zealand</w:t>
+            </w:r>
+          </w:p>
+        </w:tc>
+        <w:tc>
+          <w:tcPr>
+            <w:tcW w:w="2300" w:type="dxa"/>
+            <w:vAlign w:val="center"/>
+          </w:tcPr>
+          <w:p>
+            <w:pPr/>
+            <w:r>
+              <w:rPr>
+                <w:b w:val="1"/>
+                <w:bCs w:val="1"/>
+                <w:rtl w:val="0"/>
+              </w:rPr>
+              <w:t xml:space="preserve">Canada</w:t>
+            </w:r>
+          </w:p>
+        </w:tc>
+      </w:tr>
+      <w:tr>
+        <w:trPr>
+          <w:cantSplit w:val="1"/>
+          <w:tblHeader w:val="0"/>
+        </w:trPr>
+        <w:tc>
+          <w:tcPr>
+            <w:tcW w:w="3324" w:type="dxa"/>
+            <w:vAlign w:val="center"/>
+          </w:tcPr>
+          <w:p>
+            <w:pPr/>
+            <w:r>
+              <w:rPr>
+                <w:rtl w:val="0"/>
+              </w:rPr>
+              <w:t xml:space="preserve">University</w:t>
+            </w:r>
+          </w:p>
+        </w:tc>
+        <w:tc>
+          <w:tcPr>
+            <w:tcW w:w="2300" w:type="dxa"/>
+            <w:vAlign w:val="center"/>
+          </w:tcPr>
+          <w:p>
+            <w:pPr/>
+            <w:r>
+              <w:rPr>
+                <w:rtl w:val="0"/>
+              </w:rPr>
+              <w:t xml:space="preserve">45</w:t>
+            </w:r>
+          </w:p>
+        </w:tc>
+        <w:tc>
+          <w:tcPr>
+            <w:tcW w:w="2300" w:type="dxa"/>
+            <w:vAlign w:val="center"/>
+          </w:tcPr>
+          <w:p>
+            <w:pPr/>
+            <w:r>
+              <w:rPr>
+                <w:rtl w:val="0"/>
+              </w:rPr>
+              <w:t xml:space="preserve">8</w:t>
+            </w:r>
+          </w:p>
+        </w:tc>
+        <w:tc>
+          <w:tcPr>
+            <w:tcW w:w="2300" w:type="dxa"/>
+            <w:vAlign w:val="center"/>
+          </w:tcPr>
+          <w:p>
+            <w:pPr/>
+            <w:r>
+              <w:rPr>
+                <w:rtl w:val="0"/>
+              </w:rPr>
+              <w:t xml:space="preserve">—</w:t>
+            </w:r>
+          </w:p>
+        </w:tc>
+      </w:tr>
+      <w:tr>
+        <w:trPr>
+          <w:cantSplit w:val="1"/>
+          <w:tblHeader w:val="0"/>
+        </w:trPr>
+        <w:tc>
+          <w:tcPr>
+            <w:tcW w:w="3324" w:type="dxa"/>
+            <w:vAlign w:val="center"/>
+          </w:tcPr>
+          <w:p>
+            <w:pPr/>
+            <w:r>
+              <w:rPr>
+                <w:rtl w:val="0"/>
+              </w:rPr>
+              <w:t xml:space="preserve">University College</w:t>
+            </w:r>
+          </w:p>
+        </w:tc>
+        <w:tc>
+          <w:tcPr>
+            <w:tcW w:w="2300" w:type="dxa"/>
+            <w:vAlign w:val="center"/>
+          </w:tcPr>
+          <w:p>
+            <w:pPr/>
+            <w:r>
+              <w:rPr>
+                <w:rtl w:val="0"/>
+              </w:rPr>
+              <w:t xml:space="preserve">8</w:t>
+            </w:r>
+          </w:p>
+        </w:tc>
+        <w:tc>
+          <w:tcPr>
+            <w:tcW w:w="2300" w:type="dxa"/>
+            <w:vAlign w:val="center"/>
+          </w:tcPr>
+          <w:p>
+            <w:pPr/>
+            <w:r>
+              <w:rPr>
+                <w:rtl w:val="0"/>
+              </w:rPr>
+              <w:t xml:space="preserve">—</w:t>
+            </w:r>
+          </w:p>
+        </w:tc>
+        <w:tc>
+          <w:tcPr>
+            <w:tcW w:w="2300" w:type="dxa"/>
+            <w:vAlign w:val="center"/>
+          </w:tcPr>
+          <w:p>
+            <w:pPr/>
+            <w:r>
+              <w:rPr>
+                <w:rtl w:val="0"/>
+              </w:rPr>
+              <w:t xml:space="preserve">—</w:t>
+            </w:r>
+          </w:p>
+        </w:tc>
+      </w:tr>
+      <w:tr>
+        <w:trPr>
+          <w:cantSplit w:val="1"/>
+          <w:tblHeader w:val="0"/>
+        </w:trPr>
+        <w:tc>
+          <w:tcPr>
+            <w:tcW w:w="3324" w:type="dxa"/>
+            <w:vAlign w:val="center"/>
+          </w:tcPr>
+          <w:p>
+            <w:pPr/>
+            <w:r>
+              <w:rPr>
+                <w:rtl w:val="0"/>
+              </w:rPr>
+              <w:t xml:space="preserve">Higher Education Institute</w:t>
+            </w:r>
+          </w:p>
+        </w:tc>
+        <w:tc>
+          <w:tcPr>
+            <w:tcW w:w="2300" w:type="dxa"/>
+            <w:vAlign w:val="center"/>
+          </w:tcPr>
+          <w:p>
+            <w:pPr/>
+            <w:r>
+              <w:rPr>
+                <w:rtl w:val="0"/>
+              </w:rPr>
+              <w:t xml:space="preserve">137</w:t>
+            </w:r>
+          </w:p>
+        </w:tc>
+        <w:tc>
+          <w:tcPr>
+            <w:tcW w:w="2300" w:type="dxa"/>
+            <w:vAlign w:val="center"/>
+          </w:tcPr>
+          <w:p>
+            <w:pPr/>
+            <w:r>
+              <w:rPr>
+                <w:rtl w:val="0"/>
+              </w:rPr>
+              <w:t xml:space="preserve">—</w:t>
+            </w:r>
+          </w:p>
+        </w:tc>
+        <w:tc>
+          <w:tcPr>
+            <w:tcW w:w="2300" w:type="dxa"/>
+            <w:vAlign w:val="center"/>
+          </w:tcPr>
+          <w:p>
+            <w:pPr/>
+            <w:r>
+              <w:rPr>
+                <w:rtl w:val="0"/>
+              </w:rPr>
+              <w:t xml:space="preserve">—</w:t>
+            </w:r>
+          </w:p>
+        </w:tc>
+      </w:tr>
+      <w:tr>
+        <w:trPr>
+          <w:cantSplit w:val="1"/>
+          <w:tblHeader w:val="0"/>
+        </w:trPr>
+        <w:tc>
+          <w:tcPr>
+            <w:tcW w:w="3324" w:type="dxa"/>
+            <w:vAlign w:val="center"/>
+          </w:tcPr>
+          <w:p>
+            <w:pPr/>
+            <w:r>
+              <w:rPr>
+                <w:rtl w:val="0"/>
+              </w:rPr>
+              <w:t xml:space="preserve">TAFE / Polytechnic</w:t>
+            </w:r>
+          </w:p>
+        </w:tc>
+        <w:tc>
+          <w:tcPr>
+            <w:tcW w:w="2300" w:type="dxa"/>
+            <w:vAlign w:val="center"/>
+          </w:tcPr>
+          <w:p>
+            <w:pPr/>
+            <w:r>
+              <w:rPr>
+                <w:rtl w:val="0"/>
+              </w:rPr>
+              <w:t xml:space="preserve">16</w:t>
+            </w:r>
+          </w:p>
+        </w:tc>
+        <w:tc>
+          <w:tcPr>
+            <w:tcW w:w="2300" w:type="dxa"/>
+            <w:vAlign w:val="center"/>
+          </w:tcPr>
+          <w:p>
+            <w:pPr/>
+            <w:r>
+              <w:rPr>
+                <w:rtl w:val="0"/>
+              </w:rPr>
+              <w:t xml:space="preserve">17</w:t>
+            </w:r>
+          </w:p>
+        </w:tc>
+        <w:tc>
+          <w:tcPr>
+            <w:tcW w:w="2300" w:type="dxa"/>
+            <w:vAlign w:val="center"/>
+          </w:tcPr>
+          <w:p>
+            <w:pPr/>
+            <w:r>
+              <w:rPr>
+                <w:rtl w:val="0"/>
+              </w:rPr>
+              <w:t xml:space="preserve">—</w:t>
+            </w:r>
+          </w:p>
+        </w:tc>
+      </w:tr>
+      <w:tr>
+        <w:trPr>
+          <w:cantSplit w:val="1"/>
+          <w:tblHeader w:val="0"/>
+        </w:trPr>
+        <w:tc>
+          <w:tcPr>
+            <w:tcW w:w="3324" w:type="dxa"/>
+            <w:vAlign w:val="center"/>
+          </w:tcPr>
+          <w:p>
+            <w:pPr/>
+            <w:r>
+              <w:rPr>
+                <w:rtl w:val="0"/>
+              </w:rPr>
+              <w:t xml:space="preserve">Private VET college</w:t>
+            </w:r>
+          </w:p>
+        </w:tc>
+        <w:tc>
+          <w:tcPr>
+            <w:tcW w:w="2300" w:type="dxa"/>
+            <w:vAlign w:val="center"/>
+          </w:tcPr>
+          <w:p>
+            <w:pPr/>
+            <w:r>
+              <w:rPr>
+                <w:rtl w:val="0"/>
+              </w:rPr>
+              <w:t xml:space="preserve">935</w:t>
+            </w:r>
+          </w:p>
+        </w:tc>
+        <w:tc>
+          <w:tcPr>
+            <w:tcW w:w="2300" w:type="dxa"/>
+            <w:vAlign w:val="center"/>
+          </w:tcPr>
+          <w:p>
+            <w:pPr/>
+            <w:r>
+              <w:rPr>
+                <w:rtl w:val="0"/>
+              </w:rPr>
+              <w:t xml:space="preserve">258</w:t>
+            </w:r>
+          </w:p>
+        </w:tc>
+        <w:tc>
+          <w:tcPr>
+            <w:tcW w:w="2300" w:type="dxa"/>
+            <w:vAlign w:val="center"/>
+          </w:tcPr>
+          <w:p>
+            <w:pPr/>
+            <w:r>
+              <w:rPr>
+                <w:rtl w:val="0"/>
+              </w:rPr>
+              <w:t xml:space="preserve">—</w:t>
+            </w:r>
+          </w:p>
+        </w:tc>
+      </w:tr>
+      <w:tr>
+        <w:trPr>
+          <w:cantSplit w:val="1"/>
+          <w:tblHeader w:val="0"/>
+        </w:trPr>
+        <w:tc>
+          <w:tcPr>
+            <w:tcW w:w="3324" w:type="dxa"/>
+            <w:vAlign w:val="center"/>
+          </w:tcPr>
+          <w:p>
+            <w:pPr/>
+            <w:r>
+              <w:rPr>
+                <w:rtl w:val="0"/>
+              </w:rPr>
+              <w:t xml:space="preserve">School</w:t>
+            </w:r>
+          </w:p>
+        </w:tc>
+        <w:tc>
+          <w:tcPr>
+            <w:tcW w:w="2300" w:type="dxa"/>
+            <w:vAlign w:val="center"/>
+          </w:tcPr>
+          <w:p>
+            <w:pPr/>
+            <w:r>
+              <w:rPr>
+                <w:rtl w:val="0"/>
+              </w:rPr>
+              <w:t xml:space="preserve">302</w:t>
+            </w:r>
+          </w:p>
+        </w:tc>
+        <w:tc>
+          <w:tcPr>
+            <w:tcW w:w="2300" w:type="dxa"/>
+            <w:vAlign w:val="center"/>
+          </w:tcPr>
+          <w:p>
+            <w:pPr/>
+            <w:r>
+              <w:rPr>
+                <w:rtl w:val="0"/>
+              </w:rPr>
+              <w:t xml:space="preserve">—</w:t>
+            </w:r>
+          </w:p>
+        </w:tc>
+        <w:tc>
+          <w:tcPr>
+            <w:tcW w:w="2300" w:type="dxa"/>
+            <w:vAlign w:val="center"/>
+          </w:tcPr>
+          <w:p>
+            <w:pPr/>
+            <w:r>
+              <w:rPr>
+                <w:rtl w:val="0"/>
+              </w:rPr>
+              <w:t xml:space="preserve">—</w:t>
+            </w:r>
+          </w:p>
+        </w:tc>
+      </w:tr>
+      <w:tr>
+        <w:trPr>
+          <w:cantSplit w:val="1"/>
+          <w:tblHeader w:val="0"/>
+        </w:trPr>
+        <w:tc>
+          <w:tcPr>
+            <w:tcW w:w="3324" w:type="dxa"/>
+            <w:vAlign w:val="center"/>
+          </w:tcPr>
+          <w:p>
+            <w:pPr/>
+            <w:r>
+              <w:rPr>
+                <w:rtl w:val="0"/>
+              </w:rPr>
+              <w:t xml:space="preserve">Wānanga</w:t>
+            </w:r>
+          </w:p>
+        </w:tc>
+        <w:tc>
+          <w:tcPr>
+            <w:tcW w:w="2300" w:type="dxa"/>
+            <w:vAlign w:val="center"/>
+          </w:tcPr>
+          <w:p>
+            <w:pPr/>
+            <w:r>
+              <w:rPr>
+                <w:rtl w:val="0"/>
+              </w:rPr>
+              <w:t xml:space="preserve">—</w:t>
+            </w:r>
+          </w:p>
+        </w:tc>
+        <w:tc>
+          <w:tcPr>
+            <w:tcW w:w="2300" w:type="dxa"/>
+            <w:vAlign w:val="center"/>
+          </w:tcPr>
+          <w:p>
+            <w:pPr/>
+            <w:r>
+              <w:rPr>
+                <w:rtl w:val="0"/>
+              </w:rPr>
+              <w:t xml:space="preserve">3</w:t>
+            </w:r>
+          </w:p>
+        </w:tc>
+        <w:tc>
+          <w:tcPr>
+            <w:tcW w:w="2300" w:type="dxa"/>
+            <w:vAlign w:val="center"/>
+          </w:tcPr>
+          <w:p>
+            <w:pPr/>
+            <w:r>
+              <w:rPr>
+                <w:rtl w:val="0"/>
+              </w:rPr>
+              <w:t xml:space="preserve">—</w:t>
+            </w:r>
+          </w:p>
+        </w:tc>
+      </w:tr>
+      <w:tr>
+        <w:trPr>
+          <w:cantSplit w:val="1"/>
+          <w:tblHeader w:val="0"/>
+        </w:trPr>
+        <w:tc>
+          <w:tcPr>
+            <w:tcW w:w="3324" w:type="dxa"/>
+            <w:vAlign w:val="center"/>
+          </w:tcPr>
+          <w:p>
+            <w:pPr/>
+            <w:r>
+              <w:rPr>
+                <w:rtl w:val="0"/>
+              </w:rPr>
+              <w:t xml:space="preserve">Other</w:t>
+            </w:r>
+          </w:p>
+        </w:tc>
+        <w:tc>
+          <w:tcPr>
+            <w:tcW w:w="2300" w:type="dxa"/>
+            <w:vAlign w:val="center"/>
+          </w:tcPr>
+          <w:p>
+            <w:pPr/>
+            <w:r>
+              <w:rPr>
+                <w:rtl w:val="0"/>
+              </w:rPr>
+              <w:t xml:space="preserve">98</w:t>
+            </w:r>
+          </w:p>
+        </w:tc>
+        <w:tc>
+          <w:tcPr>
+            <w:tcW w:w="2300" w:type="dxa"/>
+            <w:vAlign w:val="center"/>
+          </w:tcPr>
+          <w:p>
+            <w:pPr/>
+            <w:r>
+              <w:rPr>
+                <w:rtl w:val="0"/>
+              </w:rPr>
+              <w:t xml:space="preserve">1</w:t>
+            </w:r>
+          </w:p>
+        </w:tc>
+        <w:tc>
+          <w:tcPr>
+            <w:tcW w:w="2300" w:type="dxa"/>
+            <w:vAlign w:val="center"/>
+          </w:tcPr>
+          <w:p>
+            <w:pPr/>
+            <w:r>
+              <w:rPr>
+                <w:rtl w:val="0"/>
+              </w:rPr>
+              <w:t xml:space="preserve">—</w:t>
+            </w:r>
+          </w:p>
+        </w:tc>
+      </w:tr>
+      <w:tr>
+        <w:trPr>
+          <w:cantSplit w:val="1"/>
+          <w:tblHeader w:val="0"/>
+        </w:trPr>
+        <w:tc>
+          <w:tcPr>
+            <w:tcW w:w="3324" w:type="dxa"/>
+            <w:vAlign w:val="center"/>
+          </w:tcPr>
+          <w:p>
+            <w:pPr/>
+            <w:r>
+              <w:rPr>
+                <w:rtl w:val="0"/>
+              </w:rPr>
+              <w:t xml:space="preserve">Not held (null)</w:t>
+            </w:r>
+          </w:p>
+        </w:tc>
+        <w:tc>
+          <w:tcPr>
+            <w:tcW w:w="2300" w:type="dxa"/>
+            <w:vAlign w:val="center"/>
+          </w:tcPr>
+          <w:p>
+            <w:pPr/>
+            <w:r>
+              <w:rPr>
+                <w:rtl w:val="0"/>
+              </w:rPr>
+              <w:t xml:space="preserve">5</w:t>
+            </w:r>
+          </w:p>
+        </w:tc>
+        <w:tc>
+          <w:tcPr>
+            <w:tcW w:w="2300" w:type="dxa"/>
+            <w:vAlign w:val="center"/>
+          </w:tcPr>
+          <w:p>
+            <w:pPr/>
+            <w:r>
+              <w:rPr>
+                <w:rtl w:val="0"/>
+              </w:rPr>
+              <w:t xml:space="preserve">—</w:t>
+            </w:r>
+          </w:p>
+        </w:tc>
+        <w:tc>
+          <w:tcPr>
+            <w:tcW w:w="2300" w:type="dxa"/>
+            <w:vAlign w:val="center"/>
+          </w:tcPr>
+          <w:p>
+            <w:pPr/>
+            <w:r>
+              <w:rPr>
+                <w:rtl w:val="0"/>
+              </w:rPr>
+              <w:t xml:space="preserve">52</w:t>
+            </w:r>
+          </w:p>
+        </w:tc>
+      </w:tr>
+    </w:tbl>
+    <w:p>
+      <w:pPr>
+        <w:spacing w:after="0" w:before="0"/>
+      </w:pPr>
+    </w:p>
     <w:p>
       <w:pPr/>
       <w:r>
@@ -13611,7 +14523,7 @@
               <w:rPr>
                 <w:rtl w:val="0"/>
               </w:rPr>
-              <w:t xml:space="preserve">Institution type (university, TAFE, college)</w:t>
+              <w:t xml:space="preserve">Institution type</w:t>
             </w:r>
           </w:p>
         </w:tc>
@@ -13626,7 +14538,7 @@
               <w:rPr>
                 <w:rtl w:val="0"/>
               </w:rPr>
-              <w:t xml:space="preserve">Not held yet. It must first be mapped from the registers (CRICOS, NZQA, Canadian lists); a filter and field follow once it is held</w:t>
+              <w:t xml:space="preserve">Included (13.4) for Australia and New Zealand, from the TEQSA, CRICOS and NZQA registers. Canada is not typed yet (null). The national VET register (training.gov.au) is not used yet</w:t>
             </w:r>
           </w:p>
         </w:tc>
@@ -14765,6 +15677,57 @@
               <w:rPr>
                 <w:rtl w:val="0"/>
               </w:rPr>
+              <w:t xml:space="preserve">9b</w:t>
+            </w:r>
+          </w:p>
+        </w:tc>
+        <w:tc>
+          <w:tcPr>
+            <w:tcW w:w="2600" w:type="dxa"/>
+            <w:vAlign w:val="center"/>
+          </w:tcPr>
+          <w:p>
+            <w:pPr/>
+            <w:r>
+              <w:rPr>
+                <w:rtl w:val="0"/>
+              </w:rPr>
+              <w:t xml:space="preserve">Institution type</w:t>
+            </w:r>
+          </w:p>
+        </w:tc>
+        <w:tc>
+          <w:tcPr>
+            <w:tcW w:w="6924" w:type="dxa"/>
+            <w:vAlign w:val="center"/>
+          </w:tcPr>
+          <w:p>
+            <w:pPr/>
+            <w:r>
+              <w:rPr>
+                <w:rtl w:val="0"/>
+              </w:rPr>
+              <w:t xml:space="preserve">providers with country_codes [AU] and institution_types [university] returns 45 providers, each with institution_type code university; reference lists the eight types with counts</w:t>
+            </w:r>
+          </w:p>
+        </w:tc>
+      </w:tr>
+      <w:tr>
+        <w:trPr>
+          <w:cantSplit w:val="1"/>
+          <w:tblHeader w:val="0"/>
+        </w:trPr>
+        <w:tc>
+          <w:tcPr>
+            <w:tcW w:w="700" w:type="dxa"/>
+            <w:vAlign w:val="center"/>
+          </w:tcPr>
+          <w:p>
+            <w:pPr/>
+            <w:r>
+              <w:rPr>
+                <w:rtl w:val="0"/>
+              </w:rPr>
               <w:t xml:space="preserve">10</w:t>
             </w:r>
           </w:p>
@@ -15673,7 +16636,7 @@
               <w:rPr>
                 <w:rtl w:val="0"/>
               </w:rPr>
-              <w:t xml:space="preserve">Course display_code added and accepted by the course action; course publication_status follows the provider Published switch; scholarships published only and read from provider pages (reference_code null); platform renamed StudySearch; QILT provider statistics admitted (provider and course detail); coverage and acceptance values re-measured</w:t>
+              <w:t xml:space="preserve">Course display_code added and accepted by the course action; course publication_status follows the provider Published switch; scholarships published only and read from provider pages (reference_code null); platform renamed StudySearch; QILT provider statistics admitted (provider and course detail); institution_type added to providers and course providers, with the institution_types filter and the reference list; coverage and acceptance values re-measured</w:t>
             </w:r>
           </w:p>
         </w:tc>

</xml_diff>

<commit_message>
CF-247: v2.15.276 institution type (Decision 258); System reference 1.11; handover Version 2 reissued (#337)
Claude-Session: https://claude.ai/code/session_01XEktdbAh5nkn5fvjobpL1o

Co-authored-by: Claude Opus 5.5 <noreply@anthropic.com>
</commit_message>
<xml_diff>
--- a/docs/integrations/coursefinder-wix-api-handover-v2.docx
+++ b/docs/integrations/coursefinder-wix-api-handover-v2.docx
@@ -796,6 +796,95 @@
           <w:rtl w:val="0"/>
         </w:rPr>
         <w:t xml:space="preserve"> detail, by study level.</w:t>
+      </w:r>
+    </w:p>
+    <w:p>
+      <w:pPr>
+        <w:numPr>
+          <w:ilvl w:val="0"/>
+          <w:numId w:val="1"/>
+        </w:numPr>
+        <w:spacing w:after="0" w:before="0" w:line="276" w:lineRule="auto"/>
+        <w:ind w:left="360" w:right="0" w:hanging="360"/>
+        <w:jc w:val="left"/>
+      </w:pPr>
+      <w:r>
+        <w:rPr>
+          <w:b w:val="1"/>
+          <w:bCs w:val="1"/>
+          <w:rtl w:val="0"/>
+        </w:rPr>
+        <w:t xml:space="preserve">Institution type</w:t>
+      </w:r>
+      <w:r>
+        <w:rPr>
+          <w:rtl w:val="0"/>
+        </w:rPr>
+        <w:t xml:space="preserve"> (University, University College, Higher Education Institute, TAFE / Polytechnic, Private VET college, School, Wānanga, Other) is returned on every provider and on the provider of every course, with the </w:t>
+      </w:r>
+      <w:r>
+        <w:rPr>
+          <w:rFonts w:ascii="Consolas" w:cs="Consolas" w:eastAsia="Consolas" w:hAnsi="Consolas"/>
+          <w:color w:val="000000"/>
+          <w:sz w:val="17"/>
+          <w:szCs w:val="17"/>
+          <w:rtl w:val="0"/>
+        </w:rPr>
+        <w:t xml:space="preserve">institution_types</w:t>
+      </w:r>
+      <w:r>
+        <w:rPr>
+          <w:rtl w:val="0"/>
+        </w:rPr>
+        <w:t xml:space="preserve"> filter on </w:t>
+      </w:r>
+      <w:r>
+        <w:rPr>
+          <w:rFonts w:ascii="Consolas" w:cs="Consolas" w:eastAsia="Consolas" w:hAnsi="Consolas"/>
+          <w:color w:val="000000"/>
+          <w:sz w:val="17"/>
+          <w:szCs w:val="17"/>
+          <w:rtl w:val="0"/>
+        </w:rPr>
+        <w:t xml:space="preserve">search</w:t>
+      </w:r>
+      <w:r>
+        <w:rPr>
+          <w:rtl w:val="0"/>
+        </w:rPr>
+        <w:t xml:space="preserve"> and </w:t>
+      </w:r>
+      <w:r>
+        <w:rPr>
+          <w:rFonts w:ascii="Consolas" w:cs="Consolas" w:eastAsia="Consolas" w:hAnsi="Consolas"/>
+          <w:color w:val="000000"/>
+          <w:sz w:val="17"/>
+          <w:szCs w:val="17"/>
+          <w:rtl w:val="0"/>
+        </w:rPr>
+        <w:t xml:space="preserve">providers</w:t>
+      </w:r>
+      <w:r>
+        <w:rPr>
+          <w:rtl w:val="0"/>
+        </w:rPr>
+        <w:t xml:space="preserve"> and the list in </w:t>
+      </w:r>
+      <w:r>
+        <w:rPr>
+          <w:rFonts w:ascii="Consolas" w:cs="Consolas" w:eastAsia="Consolas" w:hAnsi="Consolas"/>
+          <w:color w:val="000000"/>
+          <w:sz w:val="17"/>
+          <w:szCs w:val="17"/>
+          <w:rtl w:val="0"/>
+        </w:rPr>
+        <w:t xml:space="preserve">reference</w:t>
+      </w:r>
+      <w:r>
+        <w:rPr>
+          <w:rtl w:val="0"/>
+        </w:rPr>
+        <w:t xml:space="preserve">. Australia and New Zealand are typed from the regulators' registers; Canada is not typed yet (null).</w:t>
       </w:r>
     </w:p>
     <w:p>
@@ -3959,7 +4048,7 @@
         <w:rPr>
           <w:rtl w:val="0"/>
         </w:rPr>
-        <w:t xml:space="preserve"> and cache the vocabularies per country: study levels, study areas, subdivisions, cities and metro areas, intake months, English tests, regional categories, university groups, scholarship amount types and study stages, each with counts. Recommended refresh: once daily.</w:t>
+        <w:t xml:space="preserve"> and cache the vocabularies per country: study levels, study areas, subdivisions, cities and metro areas, intake months, English tests, regional categories, university groups, institution types, scholarship amount types and study stages, each with counts. Recommended refresh: once daily.</w:t>
       </w:r>
     </w:p>
     <w:p>
@@ -7104,6 +7193,57 @@
               <w:rPr>
                 <w:rtl w:val="0"/>
               </w:rPr>
+              <w:t xml:space="preserve">institution_types</w:t>
+            </w:r>
+          </w:p>
+        </w:tc>
+        <w:tc>
+          <w:tcPr>
+            <w:tcW w:w="1700" w:type="dxa"/>
+            <w:vAlign w:val="center"/>
+          </w:tcPr>
+          <w:p>
+            <w:pPr/>
+            <w:r>
+              <w:rPr>
+                <w:rtl w:val="0"/>
+              </w:rPr>
+              <w:t xml:space="preserve">string[]</w:t>
+            </w:r>
+          </w:p>
+        </w:tc>
+        <w:tc>
+          <w:tcPr>
+            <w:tcW w:w="5124" w:type="dxa"/>
+            <w:vAlign w:val="center"/>
+          </w:tcPr>
+          <w:p>
+            <w:pPr/>
+            <w:r>
+              <w:rPr>
+                <w:rtl w:val="0"/>
+              </w:rPr>
+              <w:t xml:space="preserve">Institution type codes from reference: university, university_college, higher_education_institute, tafe_polytechnic, private_vet, school, wananga, other. A course matches through its provider</w:t>
+            </w:r>
+          </w:p>
+        </w:tc>
+      </w:tr>
+      <w:tr>
+        <w:trPr>
+          <w:cantSplit w:val="1"/>
+          <w:tblHeader w:val="0"/>
+        </w:trPr>
+        <w:tc>
+          <w:tcPr>
+            <w:tcW w:w="3400" w:type="dxa"/>
+            <w:vAlign w:val="center"/>
+          </w:tcPr>
+          <w:p>
+            <w:pPr/>
+            <w:r>
+              <w:rPr>
+                <w:rtl w:val="0"/>
+              </w:rPr>
               <w:t xml:space="preserve">delivery_modes</w:t>
             </w:r>
           </w:p>
@@ -7822,7 +7962,7 @@
               <w:rPr>
                 <w:rtl w:val="0"/>
               </w:rPr>
-              <w:t xml:space="preserve">provider { provider_id, name, legal_name, university_groups[], ranking_summary, logo }</w:t>
+              <w:t xml:space="preserve">provider { provider_id, name, legal_name, institution_type, university_groups[], ranking_summary, logo }</w:t>
             </w:r>
           </w:p>
         </w:tc>
@@ -7852,7 +7992,7 @@
               <w:rPr>
                 <w:rtl w:val="0"/>
               </w:rPr>
-              <w:t xml:space="preserve">Presentable name; legal name kept; ranking_summary and logo as in 13.4</w:t>
+              <w:t xml:space="preserve">Presentable name; legal name kept; institution_type, ranking_summary and logo as in 13.4</w:t>
             </w:r>
           </w:p>
         </w:tc>
@@ -9026,7 +9166,7 @@
         <w:rPr>
           <w:rtl w:val="0"/>
         </w:rPr>
-        <w:t xml:space="preserve">Filters: keyword, country_codes, subdivision_codes, cities, regional_categories, university_groups, study_level_codes (offered), study_area_codes (offered), has_scholarship, ranked_in (qs_wur, the_wur), qs_rank_max, the_rank_max, has_logo, provider_ids. Sort: name_asc (default), qs_rank_asc, the_rank_asc, course_count_desc. Detail (</w:t>
+        <w:t xml:space="preserve">Filters: keyword, country_codes, subdivision_codes, cities, regional_categories, university_groups, study_level_codes (offered), study_area_codes (offered), has_scholarship, ranked_in (qs_wur, the_wur), qs_rank_max, the_rank_max, has_logo, provider_ids, institution_types. Sort: name_asc (default), qs_rank_asc, the_rank_asc, course_count_desc. Detail (</w:t>
       </w:r>
       <w:r>
         <w:rPr>
@@ -9166,6 +9306,81 @@
           </w:tcPr>
           <w:p>
             <w:pPr/>
+          </w:p>
+        </w:tc>
+      </w:tr>
+      <w:tr>
+        <w:trPr>
+          <w:cantSplit w:val="1"/>
+          <w:tblHeader w:val="0"/>
+        </w:trPr>
+        <w:tc>
+          <w:tcPr>
+            <w:tcW w:w="4300" w:type="dxa"/>
+            <w:vAlign w:val="center"/>
+          </w:tcPr>
+          <w:p>
+            <w:pPr/>
+            <w:r>
+              <w:rPr>
+                <w:rtl w:val="0"/>
+              </w:rPr>
+              <w:t xml:space="preserve">institution_type { code, name, basis }</w:t>
+            </w:r>
+          </w:p>
+        </w:tc>
+        <w:tc>
+          <w:tcPr>
+            <w:tcW w:w="1300" w:type="dxa"/>
+            <w:vAlign w:val="center"/>
+          </w:tcPr>
+          <w:p>
+            <w:pPr/>
+            <w:r>
+              <w:rPr>
+                <w:rtl w:val="0"/>
+              </w:rPr>
+              <w:t xml:space="preserve">list</w:t>
+            </w:r>
+          </w:p>
+        </w:tc>
+        <w:tc>
+          <w:tcPr>
+            <w:tcW w:w="4624" w:type="dxa"/>
+            <w:vAlign w:val="center"/>
+          </w:tcPr>
+          <w:p>
+            <w:pPr/>
+            <w:r>
+              <w:rPr>
+                <w:b w:val="1"/>
+                <w:bCs w:val="1"/>
+                <w:rtl w:val="0"/>
+              </w:rPr>
+              <w:t xml:space="preserve">Added 14 Oct.</w:t>
+            </w:r>
+            <w:r>
+              <w:rPr>
+                <w:rtl w:val="0"/>
+              </w:rPr>
+              <w:t xml:space="preserve"> The type from the regulators' registers: Australia from the TEQSA National Register (university, university college, institute of higher education) and the CRICOS institution type with the provider's courses (a government provider offering VET is TAFE); New Zealand from the NZQA organisation type. </w:t>
+            </w:r>
+            <w:r>
+              <w:rPr>
+                <w:rFonts w:ascii="Consolas" w:cs="Consolas" w:eastAsia="Consolas" w:hAnsi="Consolas"/>
+                <w:color w:val="000000"/>
+                <w:sz w:val="17"/>
+                <w:szCs w:val="17"/>
+                <w:rtl w:val="0"/>
+              </w:rPr>
+              <w:t xml:space="preserve">basis</w:t>
+            </w:r>
+            <w:r>
+              <w:rPr>
+                <w:rtl w:val="0"/>
+              </w:rPr>
+              <w:t xml:space="preserve"> names the rule, or reads Set by a person. null when not held (Canada; a few Australian providers no rule fits)</w:t>
+            </w:r>
           </w:p>
         </w:tc>
       </w:tr>
@@ -13015,6 +13230,703 @@
         <w:spacing w:after="0" w:before="0"/>
       </w:pPr>
     </w:p>
+    <w:tbl>
+      <w:tblPr>
+        <w:tblStyle w:val="Table1"/>
+        <w:tblW w:w="10224" w:type="dxa"/>
+        <w:jc w:val="left"/>
+        <w:tblInd w:w="-108" w:type="dxa"/>
+        <w:tblBorders>
+          <w:top w:color="000000" w:space="0" w:sz="4" w:val="single"/>
+          <w:left w:color="000000" w:space="0" w:sz="4" w:val="single"/>
+          <w:bottom w:color="000000" w:space="0" w:sz="4" w:val="single"/>
+          <w:right w:color="000000" w:space="0" w:sz="4" w:val="single"/>
+          <w:insideH w:color="000000" w:space="0" w:sz="4" w:val="single"/>
+          <w:insideV w:color="000000" w:space="0" w:sz="4" w:val="single"/>
+        </w:tblBorders>
+        <w:tblLayout w:type="fixed"/>
+        <w:tblLook w:val="0400"/>
+      </w:tblPr>
+      <w:tblGrid>
+        <w:gridCol w:w="3324"/>
+        <w:gridCol w:w="2300"/>
+        <w:gridCol w:w="2300"/>
+        <w:gridCol w:w="2300"/>
+      </w:tblGrid>
+      <w:tr>
+        <w:trPr>
+          <w:cantSplit w:val="1"/>
+          <w:tblHeader w:val="1"/>
+        </w:trPr>
+        <w:tc>
+          <w:tcPr>
+            <w:tcW w:w="3324" w:type="dxa"/>
+            <w:vAlign w:val="center"/>
+          </w:tcPr>
+          <w:p>
+            <w:pPr/>
+            <w:r>
+              <w:rPr>
+                <w:b w:val="1"/>
+                <w:bCs w:val="1"/>
+                <w:rtl w:val="0"/>
+              </w:rPr>
+              <w:t xml:space="preserve">Institution type (providers with courses)</w:t>
+            </w:r>
+          </w:p>
+        </w:tc>
+        <w:tc>
+          <w:tcPr>
+            <w:tcW w:w="2300" w:type="dxa"/>
+            <w:vAlign w:val="center"/>
+          </w:tcPr>
+          <w:p>
+            <w:pPr/>
+            <w:r>
+              <w:rPr>
+                <w:b w:val="1"/>
+                <w:bCs w:val="1"/>
+                <w:rtl w:val="0"/>
+              </w:rPr>
+              <w:t xml:space="preserve">Australia</w:t>
+            </w:r>
+          </w:p>
+        </w:tc>
+        <w:tc>
+          <w:tcPr>
+            <w:tcW w:w="2300" w:type="dxa"/>
+            <w:vAlign w:val="center"/>
+          </w:tcPr>
+          <w:p>
+            <w:pPr/>
+            <w:r>
+              <w:rPr>
+                <w:b w:val="1"/>
+                <w:bCs w:val="1"/>
+                <w:rtl w:val="0"/>
+              </w:rPr>
+              <w:t xml:space="preserve">New Zealand</w:t>
+            </w:r>
+          </w:p>
+        </w:tc>
+        <w:tc>
+          <w:tcPr>
+            <w:tcW w:w="2300" w:type="dxa"/>
+            <w:vAlign w:val="center"/>
+          </w:tcPr>
+          <w:p>
+            <w:pPr/>
+            <w:r>
+              <w:rPr>
+                <w:b w:val="1"/>
+                <w:bCs w:val="1"/>
+                <w:rtl w:val="0"/>
+              </w:rPr>
+              <w:t xml:space="preserve">Canada</w:t>
+            </w:r>
+          </w:p>
+        </w:tc>
+      </w:tr>
+      <w:tr>
+        <w:trPr>
+          <w:cantSplit w:val="1"/>
+          <w:tblHeader w:val="0"/>
+        </w:trPr>
+        <w:tc>
+          <w:tcPr>
+            <w:tcW w:w="3324" w:type="dxa"/>
+            <w:vAlign w:val="center"/>
+          </w:tcPr>
+          <w:p>
+            <w:pPr/>
+            <w:r>
+              <w:rPr>
+                <w:rtl w:val="0"/>
+              </w:rPr>
+              <w:t xml:space="preserve">University</w:t>
+            </w:r>
+          </w:p>
+        </w:tc>
+        <w:tc>
+          <w:tcPr>
+            <w:tcW w:w="2300" w:type="dxa"/>
+            <w:vAlign w:val="center"/>
+          </w:tcPr>
+          <w:p>
+            <w:pPr/>
+            <w:r>
+              <w:rPr>
+                <w:rtl w:val="0"/>
+              </w:rPr>
+              <w:t xml:space="preserve">45</w:t>
+            </w:r>
+          </w:p>
+        </w:tc>
+        <w:tc>
+          <w:tcPr>
+            <w:tcW w:w="2300" w:type="dxa"/>
+            <w:vAlign w:val="center"/>
+          </w:tcPr>
+          <w:p>
+            <w:pPr/>
+            <w:r>
+              <w:rPr>
+                <w:rtl w:val="0"/>
+              </w:rPr>
+              <w:t xml:space="preserve">8</w:t>
+            </w:r>
+          </w:p>
+        </w:tc>
+        <w:tc>
+          <w:tcPr>
+            <w:tcW w:w="2300" w:type="dxa"/>
+            <w:vAlign w:val="center"/>
+          </w:tcPr>
+          <w:p>
+            <w:pPr/>
+            <w:r>
+              <w:rPr>
+                <w:rtl w:val="0"/>
+              </w:rPr>
+              <w:t xml:space="preserve">—</w:t>
+            </w:r>
+          </w:p>
+        </w:tc>
+      </w:tr>
+      <w:tr>
+        <w:trPr>
+          <w:cantSplit w:val="1"/>
+          <w:tblHeader w:val="0"/>
+        </w:trPr>
+        <w:tc>
+          <w:tcPr>
+            <w:tcW w:w="3324" w:type="dxa"/>
+            <w:vAlign w:val="center"/>
+          </w:tcPr>
+          <w:p>
+            <w:pPr/>
+            <w:r>
+              <w:rPr>
+                <w:rtl w:val="0"/>
+              </w:rPr>
+              <w:t xml:space="preserve">University College</w:t>
+            </w:r>
+          </w:p>
+        </w:tc>
+        <w:tc>
+          <w:tcPr>
+            <w:tcW w:w="2300" w:type="dxa"/>
+            <w:vAlign w:val="center"/>
+          </w:tcPr>
+          <w:p>
+            <w:pPr/>
+            <w:r>
+              <w:rPr>
+                <w:rtl w:val="0"/>
+              </w:rPr>
+              <w:t xml:space="preserve">8</w:t>
+            </w:r>
+          </w:p>
+        </w:tc>
+        <w:tc>
+          <w:tcPr>
+            <w:tcW w:w="2300" w:type="dxa"/>
+            <w:vAlign w:val="center"/>
+          </w:tcPr>
+          <w:p>
+            <w:pPr/>
+            <w:r>
+              <w:rPr>
+                <w:rtl w:val="0"/>
+              </w:rPr>
+              <w:t xml:space="preserve">—</w:t>
+            </w:r>
+          </w:p>
+        </w:tc>
+        <w:tc>
+          <w:tcPr>
+            <w:tcW w:w="2300" w:type="dxa"/>
+            <w:vAlign w:val="center"/>
+          </w:tcPr>
+          <w:p>
+            <w:pPr/>
+            <w:r>
+              <w:rPr>
+                <w:rtl w:val="0"/>
+              </w:rPr>
+              <w:t xml:space="preserve">—</w:t>
+            </w:r>
+          </w:p>
+        </w:tc>
+      </w:tr>
+      <w:tr>
+        <w:trPr>
+          <w:cantSplit w:val="1"/>
+          <w:tblHeader w:val="0"/>
+        </w:trPr>
+        <w:tc>
+          <w:tcPr>
+            <w:tcW w:w="3324" w:type="dxa"/>
+            <w:vAlign w:val="center"/>
+          </w:tcPr>
+          <w:p>
+            <w:pPr/>
+            <w:r>
+              <w:rPr>
+                <w:rtl w:val="0"/>
+              </w:rPr>
+              <w:t xml:space="preserve">Higher Education Institute</w:t>
+            </w:r>
+          </w:p>
+        </w:tc>
+        <w:tc>
+          <w:tcPr>
+            <w:tcW w:w="2300" w:type="dxa"/>
+            <w:vAlign w:val="center"/>
+          </w:tcPr>
+          <w:p>
+            <w:pPr/>
+            <w:r>
+              <w:rPr>
+                <w:rtl w:val="0"/>
+              </w:rPr>
+              <w:t xml:space="preserve">137</w:t>
+            </w:r>
+          </w:p>
+        </w:tc>
+        <w:tc>
+          <w:tcPr>
+            <w:tcW w:w="2300" w:type="dxa"/>
+            <w:vAlign w:val="center"/>
+          </w:tcPr>
+          <w:p>
+            <w:pPr/>
+            <w:r>
+              <w:rPr>
+                <w:rtl w:val="0"/>
+              </w:rPr>
+              <w:t xml:space="preserve">—</w:t>
+            </w:r>
+          </w:p>
+        </w:tc>
+        <w:tc>
+          <w:tcPr>
+            <w:tcW w:w="2300" w:type="dxa"/>
+            <w:vAlign w:val="center"/>
+          </w:tcPr>
+          <w:p>
+            <w:pPr/>
+            <w:r>
+              <w:rPr>
+                <w:rtl w:val="0"/>
+              </w:rPr>
+              <w:t xml:space="preserve">—</w:t>
+            </w:r>
+          </w:p>
+        </w:tc>
+      </w:tr>
+      <w:tr>
+        <w:trPr>
+          <w:cantSplit w:val="1"/>
+          <w:tblHeader w:val="0"/>
+        </w:trPr>
+        <w:tc>
+          <w:tcPr>
+            <w:tcW w:w="3324" w:type="dxa"/>
+            <w:vAlign w:val="center"/>
+          </w:tcPr>
+          <w:p>
+            <w:pPr/>
+            <w:r>
+              <w:rPr>
+                <w:rtl w:val="0"/>
+              </w:rPr>
+              <w:t xml:space="preserve">TAFE / Polytechnic</w:t>
+            </w:r>
+          </w:p>
+        </w:tc>
+        <w:tc>
+          <w:tcPr>
+            <w:tcW w:w="2300" w:type="dxa"/>
+            <w:vAlign w:val="center"/>
+          </w:tcPr>
+          <w:p>
+            <w:pPr/>
+            <w:r>
+              <w:rPr>
+                <w:rtl w:val="0"/>
+              </w:rPr>
+              <w:t xml:space="preserve">16</w:t>
+            </w:r>
+          </w:p>
+        </w:tc>
+        <w:tc>
+          <w:tcPr>
+            <w:tcW w:w="2300" w:type="dxa"/>
+            <w:vAlign w:val="center"/>
+          </w:tcPr>
+          <w:p>
+            <w:pPr/>
+            <w:r>
+              <w:rPr>
+                <w:rtl w:val="0"/>
+              </w:rPr>
+              <w:t xml:space="preserve">17</w:t>
+            </w:r>
+          </w:p>
+        </w:tc>
+        <w:tc>
+          <w:tcPr>
+            <w:tcW w:w="2300" w:type="dxa"/>
+            <w:vAlign w:val="center"/>
+          </w:tcPr>
+          <w:p>
+            <w:pPr/>
+            <w:r>
+              <w:rPr>
+                <w:rtl w:val="0"/>
+              </w:rPr>
+              <w:t xml:space="preserve">—</w:t>
+            </w:r>
+          </w:p>
+        </w:tc>
+      </w:tr>
+      <w:tr>
+        <w:trPr>
+          <w:cantSplit w:val="1"/>
+          <w:tblHeader w:val="0"/>
+        </w:trPr>
+        <w:tc>
+          <w:tcPr>
+            <w:tcW w:w="3324" w:type="dxa"/>
+            <w:vAlign w:val="center"/>
+          </w:tcPr>
+          <w:p>
+            <w:pPr/>
+            <w:r>
+              <w:rPr>
+                <w:rtl w:val="0"/>
+              </w:rPr>
+              <w:t xml:space="preserve">Private VET college</w:t>
+            </w:r>
+          </w:p>
+        </w:tc>
+        <w:tc>
+          <w:tcPr>
+            <w:tcW w:w="2300" w:type="dxa"/>
+            <w:vAlign w:val="center"/>
+          </w:tcPr>
+          <w:p>
+            <w:pPr/>
+            <w:r>
+              <w:rPr>
+                <w:rtl w:val="0"/>
+              </w:rPr>
+              <w:t xml:space="preserve">935</w:t>
+            </w:r>
+          </w:p>
+        </w:tc>
+        <w:tc>
+          <w:tcPr>
+            <w:tcW w:w="2300" w:type="dxa"/>
+            <w:vAlign w:val="center"/>
+          </w:tcPr>
+          <w:p>
+            <w:pPr/>
+            <w:r>
+              <w:rPr>
+                <w:rtl w:val="0"/>
+              </w:rPr>
+              <w:t xml:space="preserve">258</w:t>
+            </w:r>
+          </w:p>
+        </w:tc>
+        <w:tc>
+          <w:tcPr>
+            <w:tcW w:w="2300" w:type="dxa"/>
+            <w:vAlign w:val="center"/>
+          </w:tcPr>
+          <w:p>
+            <w:pPr/>
+            <w:r>
+              <w:rPr>
+                <w:rtl w:val="0"/>
+              </w:rPr>
+              <w:t xml:space="preserve">—</w:t>
+            </w:r>
+          </w:p>
+        </w:tc>
+      </w:tr>
+      <w:tr>
+        <w:trPr>
+          <w:cantSplit w:val="1"/>
+          <w:tblHeader w:val="0"/>
+        </w:trPr>
+        <w:tc>
+          <w:tcPr>
+            <w:tcW w:w="3324" w:type="dxa"/>
+            <w:vAlign w:val="center"/>
+          </w:tcPr>
+          <w:p>
+            <w:pPr/>
+            <w:r>
+              <w:rPr>
+                <w:rtl w:val="0"/>
+              </w:rPr>
+              <w:t xml:space="preserve">School</w:t>
+            </w:r>
+          </w:p>
+        </w:tc>
+        <w:tc>
+          <w:tcPr>
+            <w:tcW w:w="2300" w:type="dxa"/>
+            <w:vAlign w:val="center"/>
+          </w:tcPr>
+          <w:p>
+            <w:pPr/>
+            <w:r>
+              <w:rPr>
+                <w:rtl w:val="0"/>
+              </w:rPr>
+              <w:t xml:space="preserve">302</w:t>
+            </w:r>
+          </w:p>
+        </w:tc>
+        <w:tc>
+          <w:tcPr>
+            <w:tcW w:w="2300" w:type="dxa"/>
+            <w:vAlign w:val="center"/>
+          </w:tcPr>
+          <w:p>
+            <w:pPr/>
+            <w:r>
+              <w:rPr>
+                <w:rtl w:val="0"/>
+              </w:rPr>
+              <w:t xml:space="preserve">—</w:t>
+            </w:r>
+          </w:p>
+        </w:tc>
+        <w:tc>
+          <w:tcPr>
+            <w:tcW w:w="2300" w:type="dxa"/>
+            <w:vAlign w:val="center"/>
+          </w:tcPr>
+          <w:p>
+            <w:pPr/>
+            <w:r>
+              <w:rPr>
+                <w:rtl w:val="0"/>
+              </w:rPr>
+              <w:t xml:space="preserve">—</w:t>
+            </w:r>
+          </w:p>
+        </w:tc>
+      </w:tr>
+      <w:tr>
+        <w:trPr>
+          <w:cantSplit w:val="1"/>
+          <w:tblHeader w:val="0"/>
+        </w:trPr>
+        <w:tc>
+          <w:tcPr>
+            <w:tcW w:w="3324" w:type="dxa"/>
+            <w:vAlign w:val="center"/>
+          </w:tcPr>
+          <w:p>
+            <w:pPr/>
+            <w:r>
+              <w:rPr>
+                <w:rtl w:val="0"/>
+              </w:rPr>
+              <w:t xml:space="preserve">Wānanga</w:t>
+            </w:r>
+          </w:p>
+        </w:tc>
+        <w:tc>
+          <w:tcPr>
+            <w:tcW w:w="2300" w:type="dxa"/>
+            <w:vAlign w:val="center"/>
+          </w:tcPr>
+          <w:p>
+            <w:pPr/>
+            <w:r>
+              <w:rPr>
+                <w:rtl w:val="0"/>
+              </w:rPr>
+              <w:t xml:space="preserve">—</w:t>
+            </w:r>
+          </w:p>
+        </w:tc>
+        <w:tc>
+          <w:tcPr>
+            <w:tcW w:w="2300" w:type="dxa"/>
+            <w:vAlign w:val="center"/>
+          </w:tcPr>
+          <w:p>
+            <w:pPr/>
+            <w:r>
+              <w:rPr>
+                <w:rtl w:val="0"/>
+              </w:rPr>
+              <w:t xml:space="preserve">3</w:t>
+            </w:r>
+          </w:p>
+        </w:tc>
+        <w:tc>
+          <w:tcPr>
+            <w:tcW w:w="2300" w:type="dxa"/>
+            <w:vAlign w:val="center"/>
+          </w:tcPr>
+          <w:p>
+            <w:pPr/>
+            <w:r>
+              <w:rPr>
+                <w:rtl w:val="0"/>
+              </w:rPr>
+              <w:t xml:space="preserve">—</w:t>
+            </w:r>
+          </w:p>
+        </w:tc>
+      </w:tr>
+      <w:tr>
+        <w:trPr>
+          <w:cantSplit w:val="1"/>
+          <w:tblHeader w:val="0"/>
+        </w:trPr>
+        <w:tc>
+          <w:tcPr>
+            <w:tcW w:w="3324" w:type="dxa"/>
+            <w:vAlign w:val="center"/>
+          </w:tcPr>
+          <w:p>
+            <w:pPr/>
+            <w:r>
+              <w:rPr>
+                <w:rtl w:val="0"/>
+              </w:rPr>
+              <w:t xml:space="preserve">Other</w:t>
+            </w:r>
+          </w:p>
+        </w:tc>
+        <w:tc>
+          <w:tcPr>
+            <w:tcW w:w="2300" w:type="dxa"/>
+            <w:vAlign w:val="center"/>
+          </w:tcPr>
+          <w:p>
+            <w:pPr/>
+            <w:r>
+              <w:rPr>
+                <w:rtl w:val="0"/>
+              </w:rPr>
+              <w:t xml:space="preserve">98</w:t>
+            </w:r>
+          </w:p>
+        </w:tc>
+        <w:tc>
+          <w:tcPr>
+            <w:tcW w:w="2300" w:type="dxa"/>
+            <w:vAlign w:val="center"/>
+          </w:tcPr>
+          <w:p>
+            <w:pPr/>
+            <w:r>
+              <w:rPr>
+                <w:rtl w:val="0"/>
+              </w:rPr>
+              <w:t xml:space="preserve">1</w:t>
+            </w:r>
+          </w:p>
+        </w:tc>
+        <w:tc>
+          <w:tcPr>
+            <w:tcW w:w="2300" w:type="dxa"/>
+            <w:vAlign w:val="center"/>
+          </w:tcPr>
+          <w:p>
+            <w:pPr/>
+            <w:r>
+              <w:rPr>
+                <w:rtl w:val="0"/>
+              </w:rPr>
+              <w:t xml:space="preserve">—</w:t>
+            </w:r>
+          </w:p>
+        </w:tc>
+      </w:tr>
+      <w:tr>
+        <w:trPr>
+          <w:cantSplit w:val="1"/>
+          <w:tblHeader w:val="0"/>
+        </w:trPr>
+        <w:tc>
+          <w:tcPr>
+            <w:tcW w:w="3324" w:type="dxa"/>
+            <w:vAlign w:val="center"/>
+          </w:tcPr>
+          <w:p>
+            <w:pPr/>
+            <w:r>
+              <w:rPr>
+                <w:rtl w:val="0"/>
+              </w:rPr>
+              <w:t xml:space="preserve">Not held (null)</w:t>
+            </w:r>
+          </w:p>
+        </w:tc>
+        <w:tc>
+          <w:tcPr>
+            <w:tcW w:w="2300" w:type="dxa"/>
+            <w:vAlign w:val="center"/>
+          </w:tcPr>
+          <w:p>
+            <w:pPr/>
+            <w:r>
+              <w:rPr>
+                <w:rtl w:val="0"/>
+              </w:rPr>
+              <w:t xml:space="preserve">5</w:t>
+            </w:r>
+          </w:p>
+        </w:tc>
+        <w:tc>
+          <w:tcPr>
+            <w:tcW w:w="2300" w:type="dxa"/>
+            <w:vAlign w:val="center"/>
+          </w:tcPr>
+          <w:p>
+            <w:pPr/>
+            <w:r>
+              <w:rPr>
+                <w:rtl w:val="0"/>
+              </w:rPr>
+              <w:t xml:space="preserve">—</w:t>
+            </w:r>
+          </w:p>
+        </w:tc>
+        <w:tc>
+          <w:tcPr>
+            <w:tcW w:w="2300" w:type="dxa"/>
+            <w:vAlign w:val="center"/>
+          </w:tcPr>
+          <w:p>
+            <w:pPr/>
+            <w:r>
+              <w:rPr>
+                <w:rtl w:val="0"/>
+              </w:rPr>
+              <w:t xml:space="preserve">52</w:t>
+            </w:r>
+          </w:p>
+        </w:tc>
+      </w:tr>
+    </w:tbl>
+    <w:p>
+      <w:pPr>
+        <w:spacing w:after="0" w:before="0"/>
+      </w:pPr>
+    </w:p>
     <w:p>
       <w:pPr/>
       <w:r>
@@ -13611,7 +14523,7 @@
               <w:rPr>
                 <w:rtl w:val="0"/>
               </w:rPr>
-              <w:t xml:space="preserve">Institution type (university, TAFE, college)</w:t>
+              <w:t xml:space="preserve">Institution type</w:t>
             </w:r>
           </w:p>
         </w:tc>
@@ -13626,7 +14538,7 @@
               <w:rPr>
                 <w:rtl w:val="0"/>
               </w:rPr>
-              <w:t xml:space="preserve">Not held yet. It must first be mapped from the registers (CRICOS, NZQA, Canadian lists); a filter and field follow once it is held</w:t>
+              <w:t xml:space="preserve">Included (13.4) for Australia and New Zealand, from the TEQSA, CRICOS and NZQA registers. Canada is not typed yet (null). The national VET register (training.gov.au) is not used yet</w:t>
             </w:r>
           </w:p>
         </w:tc>
@@ -14765,6 +15677,57 @@
               <w:rPr>
                 <w:rtl w:val="0"/>
               </w:rPr>
+              <w:t xml:space="preserve">9b</w:t>
+            </w:r>
+          </w:p>
+        </w:tc>
+        <w:tc>
+          <w:tcPr>
+            <w:tcW w:w="2600" w:type="dxa"/>
+            <w:vAlign w:val="center"/>
+          </w:tcPr>
+          <w:p>
+            <w:pPr/>
+            <w:r>
+              <w:rPr>
+                <w:rtl w:val="0"/>
+              </w:rPr>
+              <w:t xml:space="preserve">Institution type</w:t>
+            </w:r>
+          </w:p>
+        </w:tc>
+        <w:tc>
+          <w:tcPr>
+            <w:tcW w:w="6924" w:type="dxa"/>
+            <w:vAlign w:val="center"/>
+          </w:tcPr>
+          <w:p>
+            <w:pPr/>
+            <w:r>
+              <w:rPr>
+                <w:rtl w:val="0"/>
+              </w:rPr>
+              <w:t xml:space="preserve">providers with country_codes [AU] and institution_types [university] returns 45 providers, each with institution_type code university; reference lists the eight types with counts</w:t>
+            </w:r>
+          </w:p>
+        </w:tc>
+      </w:tr>
+      <w:tr>
+        <w:trPr>
+          <w:cantSplit w:val="1"/>
+          <w:tblHeader w:val="0"/>
+        </w:trPr>
+        <w:tc>
+          <w:tcPr>
+            <w:tcW w:w="700" w:type="dxa"/>
+            <w:vAlign w:val="center"/>
+          </w:tcPr>
+          <w:p>
+            <w:pPr/>
+            <w:r>
+              <w:rPr>
+                <w:rtl w:val="0"/>
+              </w:rPr>
               <w:t xml:space="preserve">10</w:t>
             </w:r>
           </w:p>
@@ -15673,7 +16636,7 @@
               <w:rPr>
                 <w:rtl w:val="0"/>
               </w:rPr>
-              <w:t xml:space="preserve">Course display_code added and accepted by the course action; course publication_status follows the provider Published switch; scholarships published only and read from provider pages (reference_code null); platform renamed StudySearch; QILT provider statistics admitted (provider and course detail); coverage and acceptance values re-measured</w:t>
+              <w:t xml:space="preserve">Course display_code added and accepted by the course action; course publication_status follows the provider Published switch; scholarships published only and read from provider pages (reference_code null); platform renamed StudySearch; QILT provider statistics admitted (provider and course detail); institution_type added to providers and course providers, with the institution_types filter and the reference list; coverage and acceptance values re-measured</w:t>
             </w:r>
           </w:p>
         </w:tc>

</xml_diff>

<commit_message>
CF-247 e126: website requirements O1 done; handover Version 2 reissued (section 14, campus sentence); register 1.1; System reference 1.12; lessons 1.3
Co-Authored-By: Claude Opus 5.5 <noreply@anthropic.com>
Claude-Session: https://claude.ai/code/session_01RnriTf32Hcv4Xqnq2DF1qq
</commit_message>
<xml_diff>
--- a/docs/integrations/coursefinder-wix-api-handover-v2.docx
+++ b/docs/integrations/coursefinder-wix-api-handover-v2.docx
@@ -7274,7 +7274,7 @@
               <w:rPr>
                 <w:rtl w:val="0"/>
               </w:rPr>
-              <w:t xml:space="preserve">Mostly on_campus today</w:t>
+              <w:t xml:space="preserve">on_campus for most courses; online, blended and on_campus_and_online where the course page states it</w:t>
             </w:r>
           </w:p>
         </w:tc>
@@ -12954,6 +12954,468 @@
               <w:rPr>
                 <w:rtl w:val="0"/>
               </w:rPr>
+              <w:t xml:space="preserve">Study area (field of study)</w:t>
+            </w:r>
+          </w:p>
+        </w:tc>
+        <w:tc>
+          <w:tcPr>
+            <w:tcW w:w="2300" w:type="dxa"/>
+            <w:vAlign w:val="center"/>
+          </w:tcPr>
+          <w:p>
+            <w:pPr/>
+            <w:r>
+              <w:rPr>
+                <w:rtl w:val="0"/>
+              </w:rPr>
+              <w:t xml:space="preserve">26,103</w:t>
+            </w:r>
+          </w:p>
+        </w:tc>
+        <w:tc>
+          <w:tcPr>
+            <w:tcW w:w="2300" w:type="dxa"/>
+            <w:vAlign w:val="center"/>
+          </w:tcPr>
+          <w:p>
+            <w:pPr/>
+            <w:r>
+              <w:rPr>
+                <w:rtl w:val="0"/>
+              </w:rPr>
+              <w:t xml:space="preserve">6,053</w:t>
+            </w:r>
+          </w:p>
+        </w:tc>
+        <w:tc>
+          <w:tcPr>
+            <w:tcW w:w="2300" w:type="dxa"/>
+            <w:vAlign w:val="center"/>
+          </w:tcPr>
+          <w:p>
+            <w:pPr/>
+            <w:r>
+              <w:rPr>
+                <w:rtl w:val="0"/>
+              </w:rPr>
+              <w:t xml:space="preserve">4,601</w:t>
+            </w:r>
+          </w:p>
+        </w:tc>
+      </w:tr>
+      <w:tr>
+        <w:trPr>
+          <w:cantSplit w:val="1"/>
+          <w:tblHeader w:val="0"/>
+        </w:trPr>
+        <w:tc>
+          <w:tcPr>
+            <w:tcW w:w="3324" w:type="dxa"/>
+            <w:vAlign w:val="center"/>
+          </w:tcPr>
+          <w:p>
+            <w:pPr/>
+            <w:r>
+              <w:rPr>
+                <w:rtl w:val="0"/>
+              </w:rPr>
+              <w:t xml:space="preserve">Study level</w:t>
+            </w:r>
+          </w:p>
+        </w:tc>
+        <w:tc>
+          <w:tcPr>
+            <w:tcW w:w="2300" w:type="dxa"/>
+            <w:vAlign w:val="center"/>
+          </w:tcPr>
+          <w:p>
+            <w:pPr/>
+            <w:r>
+              <w:rPr>
+                <w:rtl w:val="0"/>
+              </w:rPr>
+              <w:t xml:space="preserve">26,103</w:t>
+            </w:r>
+          </w:p>
+        </w:tc>
+        <w:tc>
+          <w:tcPr>
+            <w:tcW w:w="2300" w:type="dxa"/>
+            <w:vAlign w:val="center"/>
+          </w:tcPr>
+          <w:p>
+            <w:pPr/>
+            <w:r>
+              <w:rPr>
+                <w:rtl w:val="0"/>
+              </w:rPr>
+              <w:t xml:space="preserve">6,233</w:t>
+            </w:r>
+          </w:p>
+        </w:tc>
+        <w:tc>
+          <w:tcPr>
+            <w:tcW w:w="2300" w:type="dxa"/>
+            <w:vAlign w:val="center"/>
+          </w:tcPr>
+          <w:p>
+            <w:pPr/>
+            <w:r>
+              <w:rPr>
+                <w:rtl w:val="0"/>
+              </w:rPr>
+              <w:t xml:space="preserve">2,671</w:t>
+            </w:r>
+          </w:p>
+        </w:tc>
+      </w:tr>
+      <w:tr>
+        <w:trPr>
+          <w:cantSplit w:val="1"/>
+          <w:tblHeader w:val="0"/>
+        </w:trPr>
+        <w:tc>
+          <w:tcPr>
+            <w:tcW w:w="3324" w:type="dxa"/>
+            <w:vAlign w:val="center"/>
+          </w:tcPr>
+          <w:p>
+            <w:pPr/>
+            <w:r>
+              <w:rPr>
+                <w:rtl w:val="0"/>
+              </w:rPr>
+              <w:t xml:space="preserve">Duration (duration_months)</w:t>
+            </w:r>
+          </w:p>
+        </w:tc>
+        <w:tc>
+          <w:tcPr>
+            <w:tcW w:w="2300" w:type="dxa"/>
+            <w:vAlign w:val="center"/>
+          </w:tcPr>
+          <w:p>
+            <w:pPr/>
+            <w:r>
+              <w:rPr>
+                <w:rtl w:val="0"/>
+              </w:rPr>
+              <w:t xml:space="preserve">26,103</w:t>
+            </w:r>
+          </w:p>
+        </w:tc>
+        <w:tc>
+          <w:tcPr>
+            <w:tcW w:w="2300" w:type="dxa"/>
+            <w:vAlign w:val="center"/>
+          </w:tcPr>
+          <w:p>
+            <w:pPr/>
+            <w:r>
+              <w:rPr>
+                <w:rtl w:val="0"/>
+              </w:rPr>
+              <w:t xml:space="preserve">2,931</w:t>
+            </w:r>
+          </w:p>
+        </w:tc>
+        <w:tc>
+          <w:tcPr>
+            <w:tcW w:w="2300" w:type="dxa"/>
+            <w:vAlign w:val="center"/>
+          </w:tcPr>
+          <w:p>
+            <w:pPr/>
+            <w:r>
+              <w:rPr>
+                <w:rtl w:val="0"/>
+              </w:rPr>
+              <w:t xml:space="preserve">1,319</w:t>
+            </w:r>
+          </w:p>
+        </w:tc>
+      </w:tr>
+      <w:tr>
+        <w:trPr>
+          <w:cantSplit w:val="1"/>
+          <w:tblHeader w:val="0"/>
+        </w:trPr>
+        <w:tc>
+          <w:tcPr>
+            <w:tcW w:w="3324" w:type="dxa"/>
+            <w:vAlign w:val="center"/>
+          </w:tcPr>
+          <w:p>
+            <w:pPr/>
+            <w:r>
+              <w:rPr>
+                <w:rtl w:val="0"/>
+              </w:rPr>
+              <w:t xml:space="preserve">Delivery mode</w:t>
+            </w:r>
+          </w:p>
+        </w:tc>
+        <w:tc>
+          <w:tcPr>
+            <w:tcW w:w="2300" w:type="dxa"/>
+            <w:vAlign w:val="center"/>
+          </w:tcPr>
+          <w:p>
+            <w:pPr/>
+            <w:r>
+              <w:rPr>
+                <w:rtl w:val="0"/>
+              </w:rPr>
+              <w:t xml:space="preserve">26,078</w:t>
+            </w:r>
+          </w:p>
+        </w:tc>
+        <w:tc>
+          <w:tcPr>
+            <w:tcW w:w="2300" w:type="dxa"/>
+            <w:vAlign w:val="center"/>
+          </w:tcPr>
+          <w:p>
+            <w:pPr/>
+            <w:r>
+              <w:rPr>
+                <w:rtl w:val="0"/>
+              </w:rPr>
+              <w:t xml:space="preserve">3,868</w:t>
+            </w:r>
+          </w:p>
+        </w:tc>
+        <w:tc>
+          <w:tcPr>
+            <w:tcW w:w="2300" w:type="dxa"/>
+            <w:vAlign w:val="center"/>
+          </w:tcPr>
+          <w:p>
+            <w:pPr/>
+            <w:r>
+              <w:rPr>
+                <w:rtl w:val="0"/>
+              </w:rPr>
+              <w:t xml:space="preserve">3,204</w:t>
+            </w:r>
+          </w:p>
+        </w:tc>
+      </w:tr>
+      <w:tr>
+        <w:trPr>
+          <w:cantSplit w:val="1"/>
+          <w:tblHeader w:val="0"/>
+        </w:trPr>
+        <w:tc>
+          <w:tcPr>
+            <w:tcW w:w="3324" w:type="dxa"/>
+            <w:vAlign w:val="center"/>
+          </w:tcPr>
+          <w:p>
+            <w:pPr/>
+            <w:r>
+              <w:rPr>
+                <w:rtl w:val="0"/>
+              </w:rPr>
+              <w:t xml:space="preserve">At least one campus</w:t>
+            </w:r>
+          </w:p>
+        </w:tc>
+        <w:tc>
+          <w:tcPr>
+            <w:tcW w:w="2300" w:type="dxa"/>
+            <w:vAlign w:val="center"/>
+          </w:tcPr>
+          <w:p>
+            <w:pPr/>
+            <w:r>
+              <w:rPr>
+                <w:rtl w:val="0"/>
+              </w:rPr>
+              <w:t xml:space="preserve">26,069</w:t>
+            </w:r>
+          </w:p>
+        </w:tc>
+        <w:tc>
+          <w:tcPr>
+            <w:tcW w:w="2300" w:type="dxa"/>
+            <w:vAlign w:val="center"/>
+          </w:tcPr>
+          <w:p>
+            <w:pPr/>
+            <w:r>
+              <w:rPr>
+                <w:rtl w:val="0"/>
+              </w:rPr>
+              <w:t xml:space="preserve">2,603</w:t>
+            </w:r>
+          </w:p>
+        </w:tc>
+        <w:tc>
+          <w:tcPr>
+            <w:tcW w:w="2300" w:type="dxa"/>
+            <w:vAlign w:val="center"/>
+          </w:tcPr>
+          <w:p>
+            <w:pPr/>
+            <w:r>
+              <w:rPr>
+                <w:rtl w:val="0"/>
+              </w:rPr>
+              <w:t xml:space="preserve">2,332</w:t>
+            </w:r>
+          </w:p>
+        </w:tc>
+      </w:tr>
+      <w:tr>
+        <w:trPr>
+          <w:cantSplit w:val="1"/>
+          <w:tblHeader w:val="0"/>
+        </w:trPr>
+        <w:tc>
+          <w:tcPr>
+            <w:tcW w:w="3324" w:type="dxa"/>
+            <w:vAlign w:val="center"/>
+          </w:tcPr>
+          <w:p>
+            <w:pPr/>
+            <w:r>
+              <w:rPr>
+                <w:rtl w:val="0"/>
+              </w:rPr>
+              <w:t xml:space="preserve">Campus with a city</w:t>
+            </w:r>
+          </w:p>
+        </w:tc>
+        <w:tc>
+          <w:tcPr>
+            <w:tcW w:w="2300" w:type="dxa"/>
+            <w:vAlign w:val="center"/>
+          </w:tcPr>
+          <w:p>
+            <w:pPr/>
+            <w:r>
+              <w:rPr>
+                <w:rtl w:val="0"/>
+              </w:rPr>
+              <w:t xml:space="preserve">26,068</w:t>
+            </w:r>
+          </w:p>
+        </w:tc>
+        <w:tc>
+          <w:tcPr>
+            <w:tcW w:w="2300" w:type="dxa"/>
+            <w:vAlign w:val="center"/>
+          </w:tcPr>
+          <w:p>
+            <w:pPr/>
+            <w:r>
+              <w:rPr>
+                <w:rtl w:val="0"/>
+              </w:rPr>
+              <w:t xml:space="preserve">1,928</w:t>
+            </w:r>
+          </w:p>
+        </w:tc>
+        <w:tc>
+          <w:tcPr>
+            <w:tcW w:w="2300" w:type="dxa"/>
+            <w:vAlign w:val="center"/>
+          </w:tcPr>
+          <w:p>
+            <w:pPr/>
+            <w:r>
+              <w:rPr>
+                <w:rtl w:val="0"/>
+              </w:rPr>
+              <w:t xml:space="preserve">1,807</w:t>
+            </w:r>
+          </w:p>
+        </w:tc>
+      </w:tr>
+      <w:tr>
+        <w:trPr>
+          <w:cantSplit w:val="1"/>
+          <w:tblHeader w:val="0"/>
+        </w:trPr>
+        <w:tc>
+          <w:tcPr>
+            <w:tcW w:w="3324" w:type="dxa"/>
+            <w:vAlign w:val="center"/>
+          </w:tcPr>
+          <w:p>
+            <w:pPr/>
+            <w:r>
+              <w:rPr>
+                <w:rtl w:val="0"/>
+              </w:rPr>
+              <w:t xml:space="preserve">Region held (subdivision_codes, state filter)</w:t>
+            </w:r>
+          </w:p>
+        </w:tc>
+        <w:tc>
+          <w:tcPr>
+            <w:tcW w:w="2300" w:type="dxa"/>
+            <w:vAlign w:val="center"/>
+          </w:tcPr>
+          <w:p>
+            <w:pPr/>
+            <w:r>
+              <w:rPr>
+                <w:rtl w:val="0"/>
+              </w:rPr>
+              <w:t xml:space="preserve">26,068</w:t>
+            </w:r>
+          </w:p>
+        </w:tc>
+        <w:tc>
+          <w:tcPr>
+            <w:tcW w:w="2300" w:type="dxa"/>
+            <w:vAlign w:val="center"/>
+          </w:tcPr>
+          <w:p>
+            <w:pPr/>
+            <w:r>
+              <w:rPr>
+                <w:rtl w:val="0"/>
+              </w:rPr>
+              <w:t xml:space="preserve">1,111</w:t>
+            </w:r>
+          </w:p>
+        </w:tc>
+        <w:tc>
+          <w:tcPr>
+            <w:tcW w:w="2300" w:type="dxa"/>
+            <w:vAlign w:val="center"/>
+          </w:tcPr>
+          <w:p>
+            <w:pPr/>
+            <w:r>
+              <w:rPr>
+                <w:rtl w:val="0"/>
+              </w:rPr>
+              <w:t xml:space="preserve">2,332</w:t>
+            </w:r>
+          </w:p>
+        </w:tc>
+      </w:tr>
+      <w:tr>
+        <w:trPr>
+          <w:cantSplit w:val="1"/>
+          <w:tblHeader w:val="0"/>
+        </w:trPr>
+        <w:tc>
+          <w:tcPr>
+            <w:tcW w:w="3324" w:type="dxa"/>
+            <w:vAlign w:val="center"/>
+          </w:tcPr>
+          <w:p>
+            <w:pPr/>
+            <w:r>
+              <w:rPr>
+                <w:rtl w:val="0"/>
+              </w:rPr>
               <w:t xml:space="preserve">Providers with courses</w:t>
             </w:r>
           </w:p>
@@ -13016,7 +13478,7 @@
         <w:rPr>
           <w:rtl w:val="0"/>
         </w:rPr>
-        <w:t xml:space="preserve">Since 8 October: Canada roughly doubled (new provincial and college sources), and official pages, English and intakes grew in every country.</w:t>
+        <w:t xml:space="preserve">Since 8 October: Canada roughly doubled (new provincial and college sources), and official pages, English and intakes grew in every country. On 14 October New Zealand and Canadian courses gained study area, duration, delivery mode and campuses read from their own course pages.</w:t>
       </w:r>
     </w:p>
     <w:tbl>
@@ -13933,7 +14395,7 @@
         <w:rPr>
           <w:rtl w:val="0"/>
         </w:rPr>
-        <w:t xml:space="preserve">Campuses held: 3,984 (Australia; New Zealand and Canadian courses have no campus records yet). QILT statistics are returned for 116 Australian providers.</w:t>
+        <w:t xml:space="preserve">Campuses held: Australia 3,984 (registered locations, with city, postcode, metro area and regional category); New Zealand 168 and Canada 78, named on the providers’ own course pages and linked to courses on 14 October 2026. A New Zealand or Canadian campus carries a city where the page names one (NZ 95 of 168, Canada 44 of 78); postcode is mostly null; metro area and regional category apply to Australia only. A New Zealand campus carries a region (subdivision_code) only where it is in the provider’s own city, otherwise null; a Canadian campus carries its province. Duration stated in semesters returns duration_months null (294 New Zealand and Canadian courses). QILT statistics are returned for 116 Australian providers.</w:t>
       </w:r>
     </w:p>
     <w:tbl>
@@ -16637,6 +17099,42 @@
                 <w:rtl w:val="0"/>
               </w:rPr>
               <w:t xml:space="preserve">Course display_code added and accepted by the course action; course publication_status follows the provider Published switch; scholarships published only and read from provider pages (reference_code null); platform renamed StudySearch; QILT provider statistics admitted (provider and course detail); institution_type added to providers and course providers, with the institution_types filter and the reference list; coverage and acceptance values re-measured</w:t>
+            </w:r>
+          </w:p>
+        </w:tc>
+      </w:tr>
+      <w:tr>
+        <w:trPr>
+          <w:cantSplit w:val="1"/>
+          <w:tblHeader w:val="0"/>
+        </w:trPr>
+        <w:tc>
+          <w:tcPr>
+            <w:tcW w:w="2000" w:type="dxa"/>
+            <w:vAlign w:val="center"/>
+          </w:tcPr>
+          <w:p>
+            <w:pPr/>
+            <w:r>
+              <w:rPr>
+                <w:rtl w:val="0"/>
+              </w:rPr>
+              <w:t xml:space="preserve">14 Oct 2026</w:t>
+            </w:r>
+          </w:p>
+        </w:tc>
+        <w:tc>
+          <w:tcPr>
+            <w:tcW w:w="8224" w:type="dxa"/>
+            <w:vAlign w:val="center"/>
+          </w:tcPr>
+          <w:p>
+            <w:pPr/>
+            <w:r>
+              <w:rPr>
+                <w:rtl w:val="0"/>
+              </w:rPr>
+              <w:t xml:space="preserve">Section 14 re-measured after New Zealand and Canadian courses were enriched from their own course pages: study area, study level, duration, delivery mode and campuses added for New Zealand and Canada; a New Zealand campus region is returned only where it is proven (otherwise null); campus sentence and the delivery_modes note in 13.1 updated. No field, filter or action changed</w:t>
             </w:r>
           </w:p>
         </w:tc>

</xml_diff>

<commit_message>
CF-247 e126: website requirements O1 done; handover Version 2 reissued (section 14, campus sentence); register 1.1; System reference 1.12; lessons 1.3 (#339)
Claude-Session: https://claude.ai/code/session_01RnriTf32Hcv4Xqnq2DF1qq

Co-authored-by: Claude <noreply@anthropic.com>
</commit_message>
<xml_diff>
--- a/docs/integrations/coursefinder-wix-api-handover-v2.docx
+++ b/docs/integrations/coursefinder-wix-api-handover-v2.docx
@@ -7274,7 +7274,7 @@
               <w:rPr>
                 <w:rtl w:val="0"/>
               </w:rPr>
-              <w:t xml:space="preserve">Mostly on_campus today</w:t>
+              <w:t xml:space="preserve">on_campus for most courses; online, blended and on_campus_and_online where the course page states it</w:t>
             </w:r>
           </w:p>
         </w:tc>
@@ -12954,6 +12954,468 @@
               <w:rPr>
                 <w:rtl w:val="0"/>
               </w:rPr>
+              <w:t xml:space="preserve">Study area (field of study)</w:t>
+            </w:r>
+          </w:p>
+        </w:tc>
+        <w:tc>
+          <w:tcPr>
+            <w:tcW w:w="2300" w:type="dxa"/>
+            <w:vAlign w:val="center"/>
+          </w:tcPr>
+          <w:p>
+            <w:pPr/>
+            <w:r>
+              <w:rPr>
+                <w:rtl w:val="0"/>
+              </w:rPr>
+              <w:t xml:space="preserve">26,103</w:t>
+            </w:r>
+          </w:p>
+        </w:tc>
+        <w:tc>
+          <w:tcPr>
+            <w:tcW w:w="2300" w:type="dxa"/>
+            <w:vAlign w:val="center"/>
+          </w:tcPr>
+          <w:p>
+            <w:pPr/>
+            <w:r>
+              <w:rPr>
+                <w:rtl w:val="0"/>
+              </w:rPr>
+              <w:t xml:space="preserve">6,053</w:t>
+            </w:r>
+          </w:p>
+        </w:tc>
+        <w:tc>
+          <w:tcPr>
+            <w:tcW w:w="2300" w:type="dxa"/>
+            <w:vAlign w:val="center"/>
+          </w:tcPr>
+          <w:p>
+            <w:pPr/>
+            <w:r>
+              <w:rPr>
+                <w:rtl w:val="0"/>
+              </w:rPr>
+              <w:t xml:space="preserve">4,601</w:t>
+            </w:r>
+          </w:p>
+        </w:tc>
+      </w:tr>
+      <w:tr>
+        <w:trPr>
+          <w:cantSplit w:val="1"/>
+          <w:tblHeader w:val="0"/>
+        </w:trPr>
+        <w:tc>
+          <w:tcPr>
+            <w:tcW w:w="3324" w:type="dxa"/>
+            <w:vAlign w:val="center"/>
+          </w:tcPr>
+          <w:p>
+            <w:pPr/>
+            <w:r>
+              <w:rPr>
+                <w:rtl w:val="0"/>
+              </w:rPr>
+              <w:t xml:space="preserve">Study level</w:t>
+            </w:r>
+          </w:p>
+        </w:tc>
+        <w:tc>
+          <w:tcPr>
+            <w:tcW w:w="2300" w:type="dxa"/>
+            <w:vAlign w:val="center"/>
+          </w:tcPr>
+          <w:p>
+            <w:pPr/>
+            <w:r>
+              <w:rPr>
+                <w:rtl w:val="0"/>
+              </w:rPr>
+              <w:t xml:space="preserve">26,103</w:t>
+            </w:r>
+          </w:p>
+        </w:tc>
+        <w:tc>
+          <w:tcPr>
+            <w:tcW w:w="2300" w:type="dxa"/>
+            <w:vAlign w:val="center"/>
+          </w:tcPr>
+          <w:p>
+            <w:pPr/>
+            <w:r>
+              <w:rPr>
+                <w:rtl w:val="0"/>
+              </w:rPr>
+              <w:t xml:space="preserve">6,233</w:t>
+            </w:r>
+          </w:p>
+        </w:tc>
+        <w:tc>
+          <w:tcPr>
+            <w:tcW w:w="2300" w:type="dxa"/>
+            <w:vAlign w:val="center"/>
+          </w:tcPr>
+          <w:p>
+            <w:pPr/>
+            <w:r>
+              <w:rPr>
+                <w:rtl w:val="0"/>
+              </w:rPr>
+              <w:t xml:space="preserve">2,671</w:t>
+            </w:r>
+          </w:p>
+        </w:tc>
+      </w:tr>
+      <w:tr>
+        <w:trPr>
+          <w:cantSplit w:val="1"/>
+          <w:tblHeader w:val="0"/>
+        </w:trPr>
+        <w:tc>
+          <w:tcPr>
+            <w:tcW w:w="3324" w:type="dxa"/>
+            <w:vAlign w:val="center"/>
+          </w:tcPr>
+          <w:p>
+            <w:pPr/>
+            <w:r>
+              <w:rPr>
+                <w:rtl w:val="0"/>
+              </w:rPr>
+              <w:t xml:space="preserve">Duration (duration_months)</w:t>
+            </w:r>
+          </w:p>
+        </w:tc>
+        <w:tc>
+          <w:tcPr>
+            <w:tcW w:w="2300" w:type="dxa"/>
+            <w:vAlign w:val="center"/>
+          </w:tcPr>
+          <w:p>
+            <w:pPr/>
+            <w:r>
+              <w:rPr>
+                <w:rtl w:val="0"/>
+              </w:rPr>
+              <w:t xml:space="preserve">26,103</w:t>
+            </w:r>
+          </w:p>
+        </w:tc>
+        <w:tc>
+          <w:tcPr>
+            <w:tcW w:w="2300" w:type="dxa"/>
+            <w:vAlign w:val="center"/>
+          </w:tcPr>
+          <w:p>
+            <w:pPr/>
+            <w:r>
+              <w:rPr>
+                <w:rtl w:val="0"/>
+              </w:rPr>
+              <w:t xml:space="preserve">2,931</w:t>
+            </w:r>
+          </w:p>
+        </w:tc>
+        <w:tc>
+          <w:tcPr>
+            <w:tcW w:w="2300" w:type="dxa"/>
+            <w:vAlign w:val="center"/>
+          </w:tcPr>
+          <w:p>
+            <w:pPr/>
+            <w:r>
+              <w:rPr>
+                <w:rtl w:val="0"/>
+              </w:rPr>
+              <w:t xml:space="preserve">1,319</w:t>
+            </w:r>
+          </w:p>
+        </w:tc>
+      </w:tr>
+      <w:tr>
+        <w:trPr>
+          <w:cantSplit w:val="1"/>
+          <w:tblHeader w:val="0"/>
+        </w:trPr>
+        <w:tc>
+          <w:tcPr>
+            <w:tcW w:w="3324" w:type="dxa"/>
+            <w:vAlign w:val="center"/>
+          </w:tcPr>
+          <w:p>
+            <w:pPr/>
+            <w:r>
+              <w:rPr>
+                <w:rtl w:val="0"/>
+              </w:rPr>
+              <w:t xml:space="preserve">Delivery mode</w:t>
+            </w:r>
+          </w:p>
+        </w:tc>
+        <w:tc>
+          <w:tcPr>
+            <w:tcW w:w="2300" w:type="dxa"/>
+            <w:vAlign w:val="center"/>
+          </w:tcPr>
+          <w:p>
+            <w:pPr/>
+            <w:r>
+              <w:rPr>
+                <w:rtl w:val="0"/>
+              </w:rPr>
+              <w:t xml:space="preserve">26,078</w:t>
+            </w:r>
+          </w:p>
+        </w:tc>
+        <w:tc>
+          <w:tcPr>
+            <w:tcW w:w="2300" w:type="dxa"/>
+            <w:vAlign w:val="center"/>
+          </w:tcPr>
+          <w:p>
+            <w:pPr/>
+            <w:r>
+              <w:rPr>
+                <w:rtl w:val="0"/>
+              </w:rPr>
+              <w:t xml:space="preserve">3,868</w:t>
+            </w:r>
+          </w:p>
+        </w:tc>
+        <w:tc>
+          <w:tcPr>
+            <w:tcW w:w="2300" w:type="dxa"/>
+            <w:vAlign w:val="center"/>
+          </w:tcPr>
+          <w:p>
+            <w:pPr/>
+            <w:r>
+              <w:rPr>
+                <w:rtl w:val="0"/>
+              </w:rPr>
+              <w:t xml:space="preserve">3,204</w:t>
+            </w:r>
+          </w:p>
+        </w:tc>
+      </w:tr>
+      <w:tr>
+        <w:trPr>
+          <w:cantSplit w:val="1"/>
+          <w:tblHeader w:val="0"/>
+        </w:trPr>
+        <w:tc>
+          <w:tcPr>
+            <w:tcW w:w="3324" w:type="dxa"/>
+            <w:vAlign w:val="center"/>
+          </w:tcPr>
+          <w:p>
+            <w:pPr/>
+            <w:r>
+              <w:rPr>
+                <w:rtl w:val="0"/>
+              </w:rPr>
+              <w:t xml:space="preserve">At least one campus</w:t>
+            </w:r>
+          </w:p>
+        </w:tc>
+        <w:tc>
+          <w:tcPr>
+            <w:tcW w:w="2300" w:type="dxa"/>
+            <w:vAlign w:val="center"/>
+          </w:tcPr>
+          <w:p>
+            <w:pPr/>
+            <w:r>
+              <w:rPr>
+                <w:rtl w:val="0"/>
+              </w:rPr>
+              <w:t xml:space="preserve">26,069</w:t>
+            </w:r>
+          </w:p>
+        </w:tc>
+        <w:tc>
+          <w:tcPr>
+            <w:tcW w:w="2300" w:type="dxa"/>
+            <w:vAlign w:val="center"/>
+          </w:tcPr>
+          <w:p>
+            <w:pPr/>
+            <w:r>
+              <w:rPr>
+                <w:rtl w:val="0"/>
+              </w:rPr>
+              <w:t xml:space="preserve">2,603</w:t>
+            </w:r>
+          </w:p>
+        </w:tc>
+        <w:tc>
+          <w:tcPr>
+            <w:tcW w:w="2300" w:type="dxa"/>
+            <w:vAlign w:val="center"/>
+          </w:tcPr>
+          <w:p>
+            <w:pPr/>
+            <w:r>
+              <w:rPr>
+                <w:rtl w:val="0"/>
+              </w:rPr>
+              <w:t xml:space="preserve">2,332</w:t>
+            </w:r>
+          </w:p>
+        </w:tc>
+      </w:tr>
+      <w:tr>
+        <w:trPr>
+          <w:cantSplit w:val="1"/>
+          <w:tblHeader w:val="0"/>
+        </w:trPr>
+        <w:tc>
+          <w:tcPr>
+            <w:tcW w:w="3324" w:type="dxa"/>
+            <w:vAlign w:val="center"/>
+          </w:tcPr>
+          <w:p>
+            <w:pPr/>
+            <w:r>
+              <w:rPr>
+                <w:rtl w:val="0"/>
+              </w:rPr>
+              <w:t xml:space="preserve">Campus with a city</w:t>
+            </w:r>
+          </w:p>
+        </w:tc>
+        <w:tc>
+          <w:tcPr>
+            <w:tcW w:w="2300" w:type="dxa"/>
+            <w:vAlign w:val="center"/>
+          </w:tcPr>
+          <w:p>
+            <w:pPr/>
+            <w:r>
+              <w:rPr>
+                <w:rtl w:val="0"/>
+              </w:rPr>
+              <w:t xml:space="preserve">26,068</w:t>
+            </w:r>
+          </w:p>
+        </w:tc>
+        <w:tc>
+          <w:tcPr>
+            <w:tcW w:w="2300" w:type="dxa"/>
+            <w:vAlign w:val="center"/>
+          </w:tcPr>
+          <w:p>
+            <w:pPr/>
+            <w:r>
+              <w:rPr>
+                <w:rtl w:val="0"/>
+              </w:rPr>
+              <w:t xml:space="preserve">1,928</w:t>
+            </w:r>
+          </w:p>
+        </w:tc>
+        <w:tc>
+          <w:tcPr>
+            <w:tcW w:w="2300" w:type="dxa"/>
+            <w:vAlign w:val="center"/>
+          </w:tcPr>
+          <w:p>
+            <w:pPr/>
+            <w:r>
+              <w:rPr>
+                <w:rtl w:val="0"/>
+              </w:rPr>
+              <w:t xml:space="preserve">1,807</w:t>
+            </w:r>
+          </w:p>
+        </w:tc>
+      </w:tr>
+      <w:tr>
+        <w:trPr>
+          <w:cantSplit w:val="1"/>
+          <w:tblHeader w:val="0"/>
+        </w:trPr>
+        <w:tc>
+          <w:tcPr>
+            <w:tcW w:w="3324" w:type="dxa"/>
+            <w:vAlign w:val="center"/>
+          </w:tcPr>
+          <w:p>
+            <w:pPr/>
+            <w:r>
+              <w:rPr>
+                <w:rtl w:val="0"/>
+              </w:rPr>
+              <w:t xml:space="preserve">Region held (subdivision_codes, state filter)</w:t>
+            </w:r>
+          </w:p>
+        </w:tc>
+        <w:tc>
+          <w:tcPr>
+            <w:tcW w:w="2300" w:type="dxa"/>
+            <w:vAlign w:val="center"/>
+          </w:tcPr>
+          <w:p>
+            <w:pPr/>
+            <w:r>
+              <w:rPr>
+                <w:rtl w:val="0"/>
+              </w:rPr>
+              <w:t xml:space="preserve">26,068</w:t>
+            </w:r>
+          </w:p>
+        </w:tc>
+        <w:tc>
+          <w:tcPr>
+            <w:tcW w:w="2300" w:type="dxa"/>
+            <w:vAlign w:val="center"/>
+          </w:tcPr>
+          <w:p>
+            <w:pPr/>
+            <w:r>
+              <w:rPr>
+                <w:rtl w:val="0"/>
+              </w:rPr>
+              <w:t xml:space="preserve">1,111</w:t>
+            </w:r>
+          </w:p>
+        </w:tc>
+        <w:tc>
+          <w:tcPr>
+            <w:tcW w:w="2300" w:type="dxa"/>
+            <w:vAlign w:val="center"/>
+          </w:tcPr>
+          <w:p>
+            <w:pPr/>
+            <w:r>
+              <w:rPr>
+                <w:rtl w:val="0"/>
+              </w:rPr>
+              <w:t xml:space="preserve">2,332</w:t>
+            </w:r>
+          </w:p>
+        </w:tc>
+      </w:tr>
+      <w:tr>
+        <w:trPr>
+          <w:cantSplit w:val="1"/>
+          <w:tblHeader w:val="0"/>
+        </w:trPr>
+        <w:tc>
+          <w:tcPr>
+            <w:tcW w:w="3324" w:type="dxa"/>
+            <w:vAlign w:val="center"/>
+          </w:tcPr>
+          <w:p>
+            <w:pPr/>
+            <w:r>
+              <w:rPr>
+                <w:rtl w:val="0"/>
+              </w:rPr>
               <w:t xml:space="preserve">Providers with courses</w:t>
             </w:r>
           </w:p>
@@ -13016,7 +13478,7 @@
         <w:rPr>
           <w:rtl w:val="0"/>
         </w:rPr>
-        <w:t xml:space="preserve">Since 8 October: Canada roughly doubled (new provincial and college sources), and official pages, English and intakes grew in every country.</w:t>
+        <w:t xml:space="preserve">Since 8 October: Canada roughly doubled (new provincial and college sources), and official pages, English and intakes grew in every country. On 14 October New Zealand and Canadian courses gained study area, duration, delivery mode and campuses read from their own course pages.</w:t>
       </w:r>
     </w:p>
     <w:tbl>
@@ -13933,7 +14395,7 @@
         <w:rPr>
           <w:rtl w:val="0"/>
         </w:rPr>
-        <w:t xml:space="preserve">Campuses held: 3,984 (Australia; New Zealand and Canadian courses have no campus records yet). QILT statistics are returned for 116 Australian providers.</w:t>
+        <w:t xml:space="preserve">Campuses held: Australia 3,984 (registered locations, with city, postcode, metro area and regional category); New Zealand 168 and Canada 78, named on the providers’ own course pages and linked to courses on 14 October 2026. A New Zealand or Canadian campus carries a city where the page names one (NZ 95 of 168, Canada 44 of 78); postcode is mostly null; metro area and regional category apply to Australia only. A New Zealand campus carries a region (subdivision_code) only where it is in the provider’s own city, otherwise null; a Canadian campus carries its province. Duration stated in semesters returns duration_months null (294 New Zealand and Canadian courses). QILT statistics are returned for 116 Australian providers.</w:t>
       </w:r>
     </w:p>
     <w:tbl>
@@ -16637,6 +17099,42 @@
                 <w:rtl w:val="0"/>
               </w:rPr>
               <w:t xml:space="preserve">Course display_code added and accepted by the course action; course publication_status follows the provider Published switch; scholarships published only and read from provider pages (reference_code null); platform renamed StudySearch; QILT provider statistics admitted (provider and course detail); institution_type added to providers and course providers, with the institution_types filter and the reference list; coverage and acceptance values re-measured</w:t>
+            </w:r>
+          </w:p>
+        </w:tc>
+      </w:tr>
+      <w:tr>
+        <w:trPr>
+          <w:cantSplit w:val="1"/>
+          <w:tblHeader w:val="0"/>
+        </w:trPr>
+        <w:tc>
+          <w:tcPr>
+            <w:tcW w:w="2000" w:type="dxa"/>
+            <w:vAlign w:val="center"/>
+          </w:tcPr>
+          <w:p>
+            <w:pPr/>
+            <w:r>
+              <w:rPr>
+                <w:rtl w:val="0"/>
+              </w:rPr>
+              <w:t xml:space="preserve">14 Oct 2026</w:t>
+            </w:r>
+          </w:p>
+        </w:tc>
+        <w:tc>
+          <w:tcPr>
+            <w:tcW w:w="8224" w:type="dxa"/>
+            <w:vAlign w:val="center"/>
+          </w:tcPr>
+          <w:p>
+            <w:pPr/>
+            <w:r>
+              <w:rPr>
+                <w:rtl w:val="0"/>
+              </w:rPr>
+              <w:t xml:space="preserve">Section 14 re-measured after New Zealand and Canadian courses were enriched from their own course pages: study area, study level, duration, delivery mode and campuses added for New Zealand and Canada; a New Zealand campus region is returned only where it is proven (otherwise null); campus sentence and the delivery_modes note in 13.1 updated. No field, filter or action changed</w:t>
             </w:r>
           </w:p>
         </w:tc>

</xml_diff>

<commit_message>
CF-247 e127: O7 done (fee-line durations withdrawn, worker v0.23.2); Deployed UAT green; handover reissued; register 1.2; lessons 1.4
Co-Authored-By: Claude Opus 5.5 <noreply@anthropic.com>
Claude-Session: https://claude.ai/code/session_01RnriTf32Hcv4Xqnq2DF1qq
</commit_message>
<xml_diff>
--- a/docs/integrations/coursefinder-wix-api-handover-v2.docx
+++ b/docs/integrations/coursefinder-wix-api-handover-v2.docx
@@ -13116,7 +13116,7 @@
               <w:rPr>
                 <w:rtl w:val="0"/>
               </w:rPr>
-              <w:t xml:space="preserve">2,931</w:t>
+              <w:t xml:space="preserve">2,929</w:t>
             </w:r>
           </w:p>
         </w:tc>
@@ -14928,7 +14928,7 @@
               <w:rPr>
                 <w:rtl w:val="0"/>
               </w:rPr>
-              <w:t xml:space="preserve">A few provider-page fees are wrong at source (for example a foundation programme showing about A$230,000 a year); report odd values with the course_id and they are corrected at source</w:t>
+              <w:t xml:space="preserve">A few provider-page fees are wrong at source (for example a foundation programme showing about A$230,000 a year); report odd values with the course_id and they are corrected at source. A course length is admitted only from words about the course itself, never from a fee basis such as “fee displayed is for 1 year of study”</w:t>
             </w:r>
           </w:p>
         </w:tc>
@@ -17135,6 +17135,42 @@
                 <w:rtl w:val="0"/>
               </w:rPr>
               <w:t xml:space="preserve">Section 14 re-measured after New Zealand and Canadian courses were enriched from their own course pages: study area, study level, duration, delivery mode and campuses added for New Zealand and Canada; a New Zealand campus region is returned only where it is proven (otherwise null); campus sentence and the delivery_modes note in 13.1 updated. No field, filter or action changed</w:t>
+            </w:r>
+          </w:p>
+        </w:tc>
+      </w:tr>
+      <w:tr>
+        <w:trPr>
+          <w:cantSplit w:val="1"/>
+          <w:tblHeader w:val="0"/>
+        </w:trPr>
+        <w:tc>
+          <w:tcPr>
+            <w:tcW w:w="2000" w:type="dxa"/>
+            <w:vAlign w:val="center"/>
+          </w:tcPr>
+          <w:p>
+            <w:pPr/>
+            <w:r>
+              <w:rPr>
+                <w:rtl w:val="0"/>
+              </w:rPr>
+              <w:t xml:space="preserve">14 Oct 2026</w:t>
+            </w:r>
+          </w:p>
+        </w:tc>
+        <w:tc>
+          <w:tcPr>
+            <w:tcW w:w="8224" w:type="dxa"/>
+            <w:vAlign w:val="center"/>
+          </w:tcPr>
+          <w:p>
+            <w:pPr/>
+            <w:r>
+              <w:rPr>
+                <w:rtl w:val="0"/>
+              </w:rPr>
+              <w:t xml:space="preserve">Two New Zealand course durations that had been read from a fee line were withdrawn (duration_months now null for them; New Zealand total 2,929); durations stated in semesters stay null. No field, filter or action changed</w:t>
             </w:r>
           </w:p>
         </w:tc>

</xml_diff>

<commit_message>
CF-247 e127: O7 done (fee-line durations withdrawn, worker v0.23.2); Deployed UAT green; handover reissued; register 1.2; lessons 1.4 (#340)
Claude-Session: https://claude.ai/code/session_01RnriTf32Hcv4Xqnq2DF1qq

Co-authored-by: Claude <noreply@anthropic.com>
</commit_message>
<xml_diff>
--- a/docs/integrations/coursefinder-wix-api-handover-v2.docx
+++ b/docs/integrations/coursefinder-wix-api-handover-v2.docx
@@ -13116,7 +13116,7 @@
               <w:rPr>
                 <w:rtl w:val="0"/>
               </w:rPr>
-              <w:t xml:space="preserve">2,931</w:t>
+              <w:t xml:space="preserve">2,929</w:t>
             </w:r>
           </w:p>
         </w:tc>
@@ -14928,7 +14928,7 @@
               <w:rPr>
                 <w:rtl w:val="0"/>
               </w:rPr>
-              <w:t xml:space="preserve">A few provider-page fees are wrong at source (for example a foundation programme showing about A$230,000 a year); report odd values with the course_id and they are corrected at source</w:t>
+              <w:t xml:space="preserve">A few provider-page fees are wrong at source (for example a foundation programme showing about A$230,000 a year); report odd values with the course_id and they are corrected at source. A course length is admitted only from words about the course itself, never from a fee basis such as “fee displayed is for 1 year of study”</w:t>
             </w:r>
           </w:p>
         </w:tc>
@@ -17135,6 +17135,42 @@
                 <w:rtl w:val="0"/>
               </w:rPr>
               <w:t xml:space="preserve">Section 14 re-measured after New Zealand and Canadian courses were enriched from their own course pages: study area, study level, duration, delivery mode and campuses added for New Zealand and Canada; a New Zealand campus region is returned only where it is proven (otherwise null); campus sentence and the delivery_modes note in 13.1 updated. No field, filter or action changed</w:t>
+            </w:r>
+          </w:p>
+        </w:tc>
+      </w:tr>
+      <w:tr>
+        <w:trPr>
+          <w:cantSplit w:val="1"/>
+          <w:tblHeader w:val="0"/>
+        </w:trPr>
+        <w:tc>
+          <w:tcPr>
+            <w:tcW w:w="2000" w:type="dxa"/>
+            <w:vAlign w:val="center"/>
+          </w:tcPr>
+          <w:p>
+            <w:pPr/>
+            <w:r>
+              <w:rPr>
+                <w:rtl w:val="0"/>
+              </w:rPr>
+              <w:t xml:space="preserve">14 Oct 2026</w:t>
+            </w:r>
+          </w:p>
+        </w:tc>
+        <w:tc>
+          <w:tcPr>
+            <w:tcW w:w="8224" w:type="dxa"/>
+            <w:vAlign w:val="center"/>
+          </w:tcPr>
+          <w:p>
+            <w:pPr/>
+            <w:r>
+              <w:rPr>
+                <w:rtl w:val="0"/>
+              </w:rPr>
+              <w:t xml:space="preserve">Two New Zealand course durations that had been read from a fee line were withdrawn (duration_months now null for them; New Zealand total 2,929); durations stated in semesters stay null. No field, filter or action changed</w:t>
             </w:r>
           </w:p>
         </w:tc>

</xml_diff>

<commit_message>
CF-247 e129: v2.15.277 website sync by cursor; rankings and logos approved; logo links a year (Decision 259); handover reissued; register 1.4; System reference 1.13; SOPs 1.18
Co-Authored-By: Claude Opus 5.5 <noreply@anthropic.com>
Claude-Session: https://claude.ai/code/session_01RnriTf32Hcv4Xqnq2DF1qq
</commit_message>
<xml_diff>
--- a/docs/integrations/coursefinder-wix-api-handover-v2.docx
+++ b/docs/integrations/coursefinder-wix-api-handover-v2.docx
@@ -273,7 +273,7 @@
               <w:rPr>
                 <w:rtl w:val="0"/>
               </w:rPr>
-              <w:t xml:space="preserve">LIVE ON PILOT — website-search-v2 released 8 October 2026; this issue checked against the live Pilot platform on 14 October 2026. FULL INDEPENDENT HANDOVER. Display of rankings and logos is subject to management's decision on usage terms</w:t>
+              <w:t xml:space="preserve">LIVE ON PILOT — website-search-v2 released 8 October 2026; this issue checked against the live Pilot platform on 14 October 2026. FULL INDEPENDENT HANDOVER. Rankings and logos are approved for display (14 October 2026)</w:t>
             </w:r>
           </w:p>
         </w:tc>
@@ -1075,7 +1075,7 @@
         <w:rPr>
           <w:rtl w:val="0"/>
         </w:rPr>
-        <w:t xml:space="preserve">; whether and how the website displays them is for management to decide.</w:t>
+        <w:t xml:space="preserve">; both are approved for display with their attribution (14 October 2026).</w:t>
       </w:r>
     </w:p>
     <w:p>
@@ -1323,13 +1323,13 @@
           <w:szCs w:val="17"/>
           <w:rtl w:val="0"/>
         </w:rPr>
-        <w:t xml:space="preserve">management_decision_pending</w:t>
-      </w:r>
-      <w:r>
-        <w:rPr>
-          <w:rtl w:val="0"/>
-        </w:rPr>
-        <w:t xml:space="preserve"> until management confirms usage terms). Do not display them publicly until the status changes or management instructs otherwise.</w:t>
+        <w:t xml:space="preserve">approved</w:t>
+      </w:r>
+      <w:r>
+        <w:rPr>
+          <w:rtl w:val="0"/>
+        </w:rPr>
+        <w:t xml:space="preserve">, 14 October 2026). Both may be displayed with their attribution; if terms_status ever reads management_decision_pending, stop displaying them.</w:t>
       </w:r>
     </w:p>
     <w:p>
@@ -1818,7 +1818,7 @@
               <w:rPr>
                 <w:rtl w:val="0"/>
               </w:rPr>
-              <w:t xml:space="preserve">reference, search, course, providers, provider, rankings, scholarships, scholarship</w:t>
+              <w:t xml:space="preserve">reference, search, course, providers, provider, rankings, scholarships, scholarship, sync</w:t>
             </w:r>
           </w:p>
         </w:tc>
@@ -4120,7 +4120,7 @@
         <w:rPr>
           <w:rtl w:val="0"/>
         </w:rPr>
-        <w:t xml:space="preserve">Logo links are signed and expire after 24 hours (</w:t>
+        <w:t xml:space="preserve">Logo links are signed and valid for 365 days (</w:t>
       </w:r>
       <w:r>
         <w:rPr>
@@ -4136,7 +4136,7 @@
         <w:rPr>
           <w:rtl w:val="0"/>
         </w:rPr>
-        <w:t xml:space="preserve">). Copy each logo into Wix Media during the provider refresh and serve the Wix copy. Re-copy only when </w:t>
+        <w:t xml:space="preserve"> gives the end). Copy each logo into Wix Media and serve the Wix copy. Re-copy when </w:t>
       </w:r>
       <w:r>
         <w:rPr>
@@ -4152,7 +4152,7 @@
         <w:rPr>
           <w:rtl w:val="0"/>
         </w:rPr>
-        <w:t xml:space="preserve"> changes. Never hotlink the signed link from visitor pages. If signing ever fails, </w:t>
+        <w:t xml:space="preserve"> changes, or when the sync action sends the logo again with a new link (it does so 30 days before the old link ends). Never hotlink the signed link from visitor pages. If signing ever fails, </w:t>
       </w:r>
       <w:r>
         <w:rPr>
@@ -4408,7 +4408,7 @@
         <w:rPr>
           <w:rtl w:val="0"/>
         </w:rPr>
-        <w:t xml:space="preserve"> and page all results before advancing the stored cursor.</w:t>
+        <w:t xml:space="preserve"> and page all results before advancing the stored cursor. Recommended from 14 October 2026: the sync action (13.8), which returns everything once and then only what changed, including removals, by a cursor.</w:t>
       </w:r>
     </w:p>
     <w:p>
@@ -4718,7 +4718,7 @@
               <w:rPr>
                 <w:rtl w:val="0"/>
               </w:rPr>
-              <w:t xml:space="preserve">Changed courses only, via changed_since</w:t>
+              <w:t xml:space="preserve">Changed items only, via the sync action (13.8) or changed_since</w:t>
             </w:r>
           </w:p>
         </w:tc>
@@ -12094,7 +12094,7 @@
         <w:rPr>
           <w:rtl w:val="0"/>
         </w:rPr>
-        <w:t xml:space="preserve">Rank values are returned exactly as published, including bands and ties; nothing is re-ranked or interpolated. Each item's attribution names the publisher, ranking and edition. terms_status is management_decision_pending until management confirms usage terms.</w:t>
+        <w:t xml:space="preserve">Rank values are returned exactly as published, including bands and ties; nothing is re-ranked or interpolated. Each item's attribution names the publisher, ranking and edition. terms_status is approved: rankings may be displayed with their attribution (14 October 2026).</w:t>
       </w:r>
     </w:p>
     <w:p>
@@ -12166,7 +12166,7 @@
         <w:rPr>
           <w:rtl w:val="0"/>
         </w:rPr>
-        <w:t xml:space="preserve"> is a signed link valid for 24 hours; copy to Wix Media at refresh and re-copy when </w:t>
+        <w:t xml:space="preserve"> is a signed link valid for 365 days; copy the file to Wix Media and re-copy when </w:t>
       </w:r>
       <w:r>
         <w:rPr>
@@ -12182,7 +12182,7 @@
         <w:rPr>
           <w:rtl w:val="0"/>
         </w:rPr>
-        <w:t xml:space="preserve"> changes.</w:t>
+        <w:t xml:space="preserve"> changes or when sync sends the logo again with a new link.</w:t>
       </w:r>
     </w:p>
     <w:p>
@@ -12290,7 +12290,307 @@
         <w:rPr>
           <w:rtl w:val="0"/>
         </w:rPr>
-        <w:t xml:space="preserve"> (management_decision_pending until management confirms usage terms).</w:t>
+        <w:t xml:space="preserve"> (approved: logos may be displayed, 14 October 2026).</w:t>
+      </w:r>
+    </w:p>
+    <w:p>
+      <w:pPr>
+        <w:pStyle w:val="Heading2"/>
+      </w:pPr>
+      <w:r>
+        <w:rPr>
+          <w:rtl w:val="0"/>
+        </w:rPr>
+        <w:t xml:space="preserve">13.8 Sync — full load, then only what changed</w:t>
+      </w:r>
+    </w:p>
+    <w:p>
+      <w:pPr/>
+      <w:r>
+        <w:rPr>
+          <w:rtl w:val="0"/>
+        </w:rPr>
+        <w:t xml:space="preserve">Use sync to keep the Wix collections current with the fewest calls. The first call (no cursor, or full_load true) returns every item the API returns, in pages. Each reply carries next_cursor: send it back on the next call. When the full load is finished, the same cursor returns only what changed since: new and changed items, and removals.</w:t>
+      </w:r>
+    </w:p>
+    <w:p>
+      <w:pPr>
+        <w:spacing w:after="0" w:before="0" w:line="276" w:lineRule="auto"/>
+        <w:ind w:left="288" w:right="0" w:firstLine="0"/>
+        <w:jc w:val="left"/>
+        <w:rPr>
+          <w:rFonts w:ascii="Consolas" w:cs="Consolas" w:eastAsia="Consolas" w:hAnsi="Consolas"/>
+          <w:color w:val="000000"/>
+          <w:sz w:val="17"/>
+          <w:szCs w:val="17"/>
+        </w:rPr>
+      </w:pPr>
+      <w:r>
+        <w:rPr>
+          <w:rFonts w:ascii="Consolas" w:cs="Consolas" w:eastAsia="Consolas" w:hAnsi="Consolas"/>
+          <w:color w:val="000000"/>
+          <w:sz w:val="17"/>
+          <w:szCs w:val="17"/>
+          <w:rtl w:val="0"/>
+        </w:rPr>
+        <w:t xml:space="preserve">{</w:t>
+      </w:r>
+    </w:p>
+    <w:p>
+      <w:pPr>
+        <w:spacing w:after="0" w:before="0" w:line="276" w:lineRule="auto"/>
+        <w:ind w:left="288" w:right="0" w:firstLine="0"/>
+        <w:jc w:val="left"/>
+        <w:rPr>
+          <w:rFonts w:ascii="Consolas" w:cs="Consolas" w:eastAsia="Consolas" w:hAnsi="Consolas"/>
+          <w:color w:val="000000"/>
+          <w:sz w:val="17"/>
+          <w:szCs w:val="17"/>
+        </w:rPr>
+      </w:pPr>
+      <w:r>
+        <w:rPr>
+          <w:rFonts w:ascii="Consolas" w:cs="Consolas" w:eastAsia="Consolas" w:hAnsi="Consolas"/>
+          <w:color w:val="000000"/>
+          <w:sz w:val="17"/>
+          <w:szCs w:val="17"/>
+          <w:rtl w:val="0"/>
+        </w:rPr>
+        <w:t xml:space="preserve">  "contract": "website-search-v2",</w:t>
+      </w:r>
+    </w:p>
+    <w:p>
+      <w:pPr>
+        <w:spacing w:after="0" w:before="0" w:line="276" w:lineRule="auto"/>
+        <w:ind w:left="288" w:right="0" w:firstLine="0"/>
+        <w:jc w:val="left"/>
+        <w:rPr>
+          <w:rFonts w:ascii="Consolas" w:cs="Consolas" w:eastAsia="Consolas" w:hAnsi="Consolas"/>
+          <w:color w:val="000000"/>
+          <w:sz w:val="17"/>
+          <w:szCs w:val="17"/>
+        </w:rPr>
+      </w:pPr>
+      <w:r>
+        <w:rPr>
+          <w:rFonts w:ascii="Consolas" w:cs="Consolas" w:eastAsia="Consolas" w:hAnsi="Consolas"/>
+          <w:color w:val="000000"/>
+          <w:sz w:val="17"/>
+          <w:szCs w:val="17"/>
+          <w:rtl w:val="0"/>
+        </w:rPr>
+        <w:t xml:space="preserve">  "action": "sync",</w:t>
+      </w:r>
+    </w:p>
+    <w:p>
+      <w:pPr>
+        <w:spacing w:after="0" w:before="0" w:line="276" w:lineRule="auto"/>
+        <w:ind w:left="288" w:right="0" w:firstLine="0"/>
+        <w:jc w:val="left"/>
+        <w:rPr>
+          <w:rFonts w:ascii="Consolas" w:cs="Consolas" w:eastAsia="Consolas" w:hAnsi="Consolas"/>
+          <w:color w:val="000000"/>
+          <w:sz w:val="17"/>
+          <w:szCs w:val="17"/>
+        </w:rPr>
+      </w:pPr>
+      <w:r>
+        <w:rPr>
+          <w:rFonts w:ascii="Consolas" w:cs="Consolas" w:eastAsia="Consolas" w:hAnsi="Consolas"/>
+          <w:color w:val="000000"/>
+          <w:sz w:val="17"/>
+          <w:szCs w:val="17"/>
+          <w:rtl w:val="0"/>
+        </w:rPr>
+        <w:t xml:space="preserve">  "cursor": "&lt;next_cursor from the last reply; omit for a full load&gt;",</w:t>
+      </w:r>
+    </w:p>
+    <w:p>
+      <w:pPr>
+        <w:spacing w:after="0" w:before="0" w:line="276" w:lineRule="auto"/>
+        <w:ind w:left="288" w:right="0" w:firstLine="0"/>
+        <w:jc w:val="left"/>
+        <w:rPr>
+          <w:rFonts w:ascii="Consolas" w:cs="Consolas" w:eastAsia="Consolas" w:hAnsi="Consolas"/>
+          <w:color w:val="000000"/>
+          <w:sz w:val="17"/>
+          <w:szCs w:val="17"/>
+        </w:rPr>
+      </w:pPr>
+      <w:r>
+        <w:rPr>
+          <w:rFonts w:ascii="Consolas" w:cs="Consolas" w:eastAsia="Consolas" w:hAnsi="Consolas"/>
+          <w:color w:val="000000"/>
+          <w:sz w:val="17"/>
+          <w:szCs w:val="17"/>
+          <w:rtl w:val="0"/>
+        </w:rPr>
+        <w:t xml:space="preserve">  "entities": ["reference", "provider", "logo", "rankings", "scholarship", "course"],</w:t>
+      </w:r>
+    </w:p>
+    <w:p>
+      <w:pPr>
+        <w:spacing w:after="0" w:before="0" w:line="276" w:lineRule="auto"/>
+        <w:ind w:left="288" w:right="0" w:firstLine="0"/>
+        <w:jc w:val="left"/>
+        <w:rPr>
+          <w:rFonts w:ascii="Consolas" w:cs="Consolas" w:eastAsia="Consolas" w:hAnsi="Consolas"/>
+          <w:color w:val="000000"/>
+          <w:sz w:val="17"/>
+          <w:szCs w:val="17"/>
+        </w:rPr>
+      </w:pPr>
+      <w:r>
+        <w:rPr>
+          <w:rFonts w:ascii="Consolas" w:cs="Consolas" w:eastAsia="Consolas" w:hAnsi="Consolas"/>
+          <w:color w:val="000000"/>
+          <w:sz w:val="17"/>
+          <w:szCs w:val="17"/>
+          <w:rtl w:val="0"/>
+        </w:rPr>
+        <w:t xml:space="preserve">  "page_size": 50</w:t>
+      </w:r>
+    </w:p>
+    <w:p>
+      <w:pPr>
+        <w:spacing w:after="0" w:before="0" w:line="276" w:lineRule="auto"/>
+        <w:ind w:left="288" w:right="0" w:firstLine="0"/>
+        <w:jc w:val="left"/>
+        <w:rPr>
+          <w:rFonts w:ascii="Consolas" w:cs="Consolas" w:eastAsia="Consolas" w:hAnsi="Consolas"/>
+          <w:color w:val="000000"/>
+          <w:sz w:val="17"/>
+          <w:szCs w:val="17"/>
+        </w:rPr>
+      </w:pPr>
+      <w:r>
+        <w:rPr>
+          <w:rFonts w:ascii="Consolas" w:cs="Consolas" w:eastAsia="Consolas" w:hAnsi="Consolas"/>
+          <w:color w:val="000000"/>
+          <w:sz w:val="17"/>
+          <w:szCs w:val="17"/>
+          <w:rtl w:val="0"/>
+        </w:rPr>
+        <w:t xml:space="preserve">}</w:t>
+      </w:r>
+    </w:p>
+    <w:p>
+      <w:pPr>
+        <w:numPr>
+          <w:ilvl w:val="0"/>
+          <w:numId w:val="1"/>
+        </w:numPr>
+        <w:spacing w:after="0" w:before="0" w:line="276" w:lineRule="auto"/>
+        <w:ind w:left="360" w:right="0" w:hanging="360"/>
+        <w:jc w:val="left"/>
+      </w:pPr>
+      <w:r>
+        <w:rPr>
+          <w:rtl w:val="0"/>
+        </w:rPr>
+        <w:t xml:space="preserve">Request: cursor (omit or null for a full load), full_load (true starts a full load again), entities (optional; all six by default; a cursor keeps the entities it started with), page_size (50 at most).</w:t>
+      </w:r>
+    </w:p>
+    <w:p>
+      <w:pPr>
+        <w:numPr>
+          <w:ilvl w:val="0"/>
+          <w:numId w:val="1"/>
+        </w:numPr>
+        <w:spacing w:after="0" w:before="0" w:line="276" w:lineRule="auto"/>
+        <w:ind w:left="360" w:right="0" w:hanging="360"/>
+        <w:jc w:val="left"/>
+      </w:pPr>
+      <w:r>
+        <w:rPr>
+          <w:rtl w:val="0"/>
+        </w:rPr>
+        <w:t xml:space="preserve">Reply: items[] { entity, id, seq, change (upsert or remove), item }, has_more, next_cursor, mode (full or delta), full_load_complete (on a full load), checked_through, as_of.</w:t>
+      </w:r>
+    </w:p>
+    <w:p>
+      <w:pPr>
+        <w:numPr>
+          <w:ilvl w:val="0"/>
+          <w:numId w:val="1"/>
+        </w:numPr>
+        <w:spacing w:after="0" w:before="0" w:line="276" w:lineRule="auto"/>
+        <w:ind w:left="360" w:right="0" w:hanging="360"/>
+        <w:jc w:val="left"/>
+      </w:pPr>
+      <w:r>
+        <w:rPr>
+          <w:rtl w:val="0"/>
+        </w:rPr>
+        <w:t xml:space="preserve">Item shapes: course is the search item (CF_Courses, 13.2); provider is the provider detail (13.4); logo is { provider_id, logo } (13.7); rankings is { provider_id, rankings[] } (13.6); scholarship is the scholarship detail (13.5); reference is the reference action.</w:t>
+      </w:r>
+    </w:p>
+    <w:p>
+      <w:pPr>
+        <w:numPr>
+          <w:ilvl w:val="0"/>
+          <w:numId w:val="1"/>
+        </w:numPr>
+        <w:spacing w:after="0" w:before="0" w:line="276" w:lineRule="auto"/>
+        <w:ind w:left="360" w:right="0" w:hanging="360"/>
+        <w:jc w:val="left"/>
+      </w:pPr>
+      <w:r>
+        <w:rPr>
+          <w:rtl w:val="0"/>
+        </w:rPr>
+        <w:t xml:space="preserve">Store next_cursor in CF_SyncState only after the page is written to Wix. If a write fails, send the same cursor again: the same items come back, and an upsert by id makes the replay safe.</w:t>
+      </w:r>
+    </w:p>
+    <w:p>
+      <w:pPr>
+        <w:numPr>
+          <w:ilvl w:val="0"/>
+          <w:numId w:val="1"/>
+        </w:numPr>
+        <w:spacing w:after="0" w:before="0" w:line="276" w:lineRule="auto"/>
+        <w:ind w:left="360" w:right="0" w:hanging="360"/>
+        <w:jc w:val="left"/>
+      </w:pPr>
+      <w:r>
+        <w:rPr>
+          <w:rtl w:val="0"/>
+        </w:rPr>
+        <w:t xml:space="preserve">change remove: delete the record by id (for example a provider switched off, with its courses, or a scholarship no longer published).</w:t>
+      </w:r>
+    </w:p>
+    <w:p>
+      <w:pPr>
+        <w:numPr>
+          <w:ilvl w:val="0"/>
+          <w:numId w:val="1"/>
+        </w:numPr>
+        <w:spacing w:after="0" w:before="0" w:line="276" w:lineRule="auto"/>
+        <w:ind w:left="360" w:right="0" w:hanging="360"/>
+        <w:jc w:val="left"/>
+      </w:pPr>
+      <w:r>
+        <w:rPr>
+          <w:rtl w:val="0"/>
+        </w:rPr>
+        <w:t xml:space="preserve">Freshness: the platform checks items every minute in a rolling pass; a full pass takes about 90 minutes. checked_through is when the last full pass finished (null until the first pass has finished); a change made after it appears in a later delta.</w:t>
+      </w:r>
+    </w:p>
+    <w:p>
+      <w:pPr>
+        <w:numPr>
+          <w:ilvl w:val="0"/>
+          <w:numId w:val="1"/>
+        </w:numPr>
+        <w:spacing w:after="0" w:before="0" w:line="276" w:lineRule="auto"/>
+        <w:ind w:left="360" w:right="0" w:hanging="360"/>
+        <w:jc w:val="left"/>
+      </w:pPr>
+      <w:r>
+        <w:rPr>
+          <w:rtl w:val="0"/>
+        </w:rPr>
+        <w:t xml:space="preserve">Size: a full load is about 40,400 items (14 October 2026), about 810 calls at 50 a page, within the limit of 60 calls a minute.</w:t>
       </w:r>
     </w:p>
     <w:p>
@@ -14676,7 +14976,7 @@
               <w:rPr>
                 <w:rtl w:val="0"/>
               </w:rPr>
-              <w:t xml:space="preserve">Included (13.6). Display is subject to management's decision on usage terms; terms_status shows the position</w:t>
+              <w:t xml:space="preserve">Included (13.6). Approved for display (14 October 2026); show the attribution; terms_status reads approved</w:t>
             </w:r>
           </w:p>
         </w:tc>
@@ -14712,7 +15012,7 @@
               <w:rPr>
                 <w:rtl w:val="0"/>
               </w:rPr>
-              <w:t xml:space="preserve">Included (13.7). Display is subject to management's decision on usage terms; keep the initials fallback for providers without a logo</w:t>
+              <w:t xml:space="preserve">Included (13.7). Approved for display (14 October 2026); keep the initials fallback for providers without a logo</w:t>
             </w:r>
           </w:p>
         </w:tc>
@@ -16322,7 +16622,7 @@
               <w:rPr>
                 <w:rtl w:val="0"/>
               </w:rPr>
-              <w:t xml:space="preserve">providers with has_logo true returns 49 providers whose logo.url opens within 24 hours; the copy in Wix Media is served to visitors</w:t>
+              <w:t xml:space="preserve">providers with has_logo true returns 49 providers whose logo.url opens and whose url_expires_at is about 365 days ahead; the copy in Wix Media is served to visitors</w:t>
             </w:r>
           </w:p>
         </w:tc>
@@ -16425,6 +16725,108 @@
                 <w:rtl w:val="0"/>
               </w:rPr>
               <w:t xml:space="preserve">changed_since with sort updated_asc returns only changed records; replay creates no duplicates</w:t>
+            </w:r>
+          </w:p>
+        </w:tc>
+      </w:tr>
+      <w:tr>
+        <w:trPr>
+          <w:cantSplit w:val="1"/>
+          <w:tblHeader w:val="0"/>
+        </w:trPr>
+        <w:tc>
+          <w:tcPr>
+            <w:tcW w:w="700" w:type="dxa"/>
+            <w:vAlign w:val="center"/>
+          </w:tcPr>
+          <w:p>
+            <w:pPr/>
+            <w:r>
+              <w:rPr>
+                <w:rtl w:val="0"/>
+              </w:rPr>
+              <w:t xml:space="preserve">12a</w:t>
+            </w:r>
+          </w:p>
+        </w:tc>
+        <w:tc>
+          <w:tcPr>
+            <w:tcW w:w="2600" w:type="dxa"/>
+            <w:vAlign w:val="center"/>
+          </w:tcPr>
+          <w:p>
+            <w:pPr/>
+            <w:r>
+              <w:rPr>
+                <w:rtl w:val="0"/>
+              </w:rPr>
+              <w:t xml:space="preserve">Sync full load</w:t>
+            </w:r>
+          </w:p>
+        </w:tc>
+        <w:tc>
+          <w:tcPr>
+            <w:tcW w:w="6924" w:type="dxa"/>
+            <w:vAlign w:val="center"/>
+          </w:tcPr>
+          <w:p>
+            <w:pPr/>
+            <w:r>
+              <w:rPr>
+                <w:rtl w:val="0"/>
+              </w:rPr>
+              <w:t xml:space="preserve">sync with no cursor and page_size 50: mode full, 50 items, has_more true; following next_cursor to the end gives full_load_complete true (about 40,400 items on 14 Oct)</w:t>
+            </w:r>
+          </w:p>
+        </w:tc>
+      </w:tr>
+      <w:tr>
+        <w:trPr>
+          <w:cantSplit w:val="1"/>
+          <w:tblHeader w:val="0"/>
+        </w:trPr>
+        <w:tc>
+          <w:tcPr>
+            <w:tcW w:w="700" w:type="dxa"/>
+            <w:vAlign w:val="center"/>
+          </w:tcPr>
+          <w:p>
+            <w:pPr/>
+            <w:r>
+              <w:rPr>
+                <w:rtl w:val="0"/>
+              </w:rPr>
+              <w:t xml:space="preserve">12b</w:t>
+            </w:r>
+          </w:p>
+        </w:tc>
+        <w:tc>
+          <w:tcPr>
+            <w:tcW w:w="2600" w:type="dxa"/>
+            <w:vAlign w:val="center"/>
+          </w:tcPr>
+          <w:p>
+            <w:pPr/>
+            <w:r>
+              <w:rPr>
+                <w:rtl w:val="0"/>
+              </w:rPr>
+              <w:t xml:space="preserve">Sync changes</w:t>
+            </w:r>
+          </w:p>
+        </w:tc>
+        <w:tc>
+          <w:tcPr>
+            <w:tcW w:w="6924" w:type="dxa"/>
+            <w:vAlign w:val="center"/>
+          </w:tcPr>
+          <w:p>
+            <w:pPr/>
+            <w:r>
+              <w:rPr>
+                <w:rtl w:val="0"/>
+              </w:rPr>
+              <w:t xml:space="preserve">the last next_cursor sent again returns only what changed since (often nothing); a provider switched off comes back as change remove for the provider and its courses</w:t>
             </w:r>
           </w:p>
         </w:tc>
@@ -17171,6 +17573,42 @@
                 <w:rtl w:val="0"/>
               </w:rPr>
               <w:t xml:space="preserve">Two New Zealand course durations that had been read from a fee line were withdrawn (duration_months now null for them; New Zealand total 2,929); durations stated in semesters stay null. No field, filter or action changed</w:t>
+            </w:r>
+          </w:p>
+        </w:tc>
+      </w:tr>
+      <w:tr>
+        <w:trPr>
+          <w:cantSplit w:val="1"/>
+          <w:tblHeader w:val="0"/>
+        </w:trPr>
+        <w:tc>
+          <w:tcPr>
+            <w:tcW w:w="2000" w:type="dxa"/>
+            <w:vAlign w:val="center"/>
+          </w:tcPr>
+          <w:p>
+            <w:pPr/>
+            <w:r>
+              <w:rPr>
+                <w:rtl w:val="0"/>
+              </w:rPr>
+              <w:t xml:space="preserve">14 Oct 2026</w:t>
+            </w:r>
+          </w:p>
+        </w:tc>
+        <w:tc>
+          <w:tcPr>
+            <w:tcW w:w="8224" w:type="dxa"/>
+            <w:vAlign w:val="center"/>
+          </w:tcPr>
+          <w:p>
+            <w:pPr/>
+            <w:r>
+              <w:rPr>
+                <w:rtl w:val="0"/>
+              </w:rPr>
+              <w:t xml:space="preserve">Rankings and logos approved for display (terms_status approved); logo links valid 365 days; new action sync (13.8): a full load in pages, then only what changed, with removals, by a cursor; acceptance tests 12a and 12b; Step B2, section 7 and section 15 updated. Every earlier field, filter and action is unchanged</w:t>
             </w:r>
           </w:p>
         </w:tc>

</xml_diff>

<commit_message>
CF-247 e129: v2.15.277 website sync by cursor; rankings and logos approved; logo links a year (Decision 259); handover reissued; register 1.4; System reference 1.13; SOPs 1.18 (#342)
Claude-Session: https://claude.ai/code/session_01RnriTf32Hcv4Xqnq2DF1qq

Co-authored-by: Claude <noreply@anthropic.com>
</commit_message>
<xml_diff>
--- a/docs/integrations/coursefinder-wix-api-handover-v2.docx
+++ b/docs/integrations/coursefinder-wix-api-handover-v2.docx
@@ -273,7 +273,7 @@
               <w:rPr>
                 <w:rtl w:val="0"/>
               </w:rPr>
-              <w:t xml:space="preserve">LIVE ON PILOT — website-search-v2 released 8 October 2026; this issue checked against the live Pilot platform on 14 October 2026. FULL INDEPENDENT HANDOVER. Display of rankings and logos is subject to management's decision on usage terms</w:t>
+              <w:t xml:space="preserve">LIVE ON PILOT — website-search-v2 released 8 October 2026; this issue checked against the live Pilot platform on 14 October 2026. FULL INDEPENDENT HANDOVER. Rankings and logos are approved for display (14 October 2026)</w:t>
             </w:r>
           </w:p>
         </w:tc>
@@ -1075,7 +1075,7 @@
         <w:rPr>
           <w:rtl w:val="0"/>
         </w:rPr>
-        <w:t xml:space="preserve">; whether and how the website displays them is for management to decide.</w:t>
+        <w:t xml:space="preserve">; both are approved for display with their attribution (14 October 2026).</w:t>
       </w:r>
     </w:p>
     <w:p>
@@ -1323,13 +1323,13 @@
           <w:szCs w:val="17"/>
           <w:rtl w:val="0"/>
         </w:rPr>
-        <w:t xml:space="preserve">management_decision_pending</w:t>
-      </w:r>
-      <w:r>
-        <w:rPr>
-          <w:rtl w:val="0"/>
-        </w:rPr>
-        <w:t xml:space="preserve"> until management confirms usage terms). Do not display them publicly until the status changes or management instructs otherwise.</w:t>
+        <w:t xml:space="preserve">approved</w:t>
+      </w:r>
+      <w:r>
+        <w:rPr>
+          <w:rtl w:val="0"/>
+        </w:rPr>
+        <w:t xml:space="preserve">, 14 October 2026). Both may be displayed with their attribution; if terms_status ever reads management_decision_pending, stop displaying them.</w:t>
       </w:r>
     </w:p>
     <w:p>
@@ -1818,7 +1818,7 @@
               <w:rPr>
                 <w:rtl w:val="0"/>
               </w:rPr>
-              <w:t xml:space="preserve">reference, search, course, providers, provider, rankings, scholarships, scholarship</w:t>
+              <w:t xml:space="preserve">reference, search, course, providers, provider, rankings, scholarships, scholarship, sync</w:t>
             </w:r>
           </w:p>
         </w:tc>
@@ -4120,7 +4120,7 @@
         <w:rPr>
           <w:rtl w:val="0"/>
         </w:rPr>
-        <w:t xml:space="preserve">Logo links are signed and expire after 24 hours (</w:t>
+        <w:t xml:space="preserve">Logo links are signed and valid for 365 days (</w:t>
       </w:r>
       <w:r>
         <w:rPr>
@@ -4136,7 +4136,7 @@
         <w:rPr>
           <w:rtl w:val="0"/>
         </w:rPr>
-        <w:t xml:space="preserve">). Copy each logo into Wix Media during the provider refresh and serve the Wix copy. Re-copy only when </w:t>
+        <w:t xml:space="preserve"> gives the end). Copy each logo into Wix Media and serve the Wix copy. Re-copy when </w:t>
       </w:r>
       <w:r>
         <w:rPr>
@@ -4152,7 +4152,7 @@
         <w:rPr>
           <w:rtl w:val="0"/>
         </w:rPr>
-        <w:t xml:space="preserve"> changes. Never hotlink the signed link from visitor pages. If signing ever fails, </w:t>
+        <w:t xml:space="preserve"> changes, or when the sync action sends the logo again with a new link (it does so 30 days before the old link ends). Never hotlink the signed link from visitor pages. If signing ever fails, </w:t>
       </w:r>
       <w:r>
         <w:rPr>
@@ -4408,7 +4408,7 @@
         <w:rPr>
           <w:rtl w:val="0"/>
         </w:rPr>
-        <w:t xml:space="preserve"> and page all results before advancing the stored cursor.</w:t>
+        <w:t xml:space="preserve"> and page all results before advancing the stored cursor. Recommended from 14 October 2026: the sync action (13.8), which returns everything once and then only what changed, including removals, by a cursor.</w:t>
       </w:r>
     </w:p>
     <w:p>
@@ -4718,7 +4718,7 @@
               <w:rPr>
                 <w:rtl w:val="0"/>
               </w:rPr>
-              <w:t xml:space="preserve">Changed courses only, via changed_since</w:t>
+              <w:t xml:space="preserve">Changed items only, via the sync action (13.8) or changed_since</w:t>
             </w:r>
           </w:p>
         </w:tc>
@@ -12094,7 +12094,7 @@
         <w:rPr>
           <w:rtl w:val="0"/>
         </w:rPr>
-        <w:t xml:space="preserve">Rank values are returned exactly as published, including bands and ties; nothing is re-ranked or interpolated. Each item's attribution names the publisher, ranking and edition. terms_status is management_decision_pending until management confirms usage terms.</w:t>
+        <w:t xml:space="preserve">Rank values are returned exactly as published, including bands and ties; nothing is re-ranked or interpolated. Each item's attribution names the publisher, ranking and edition. terms_status is approved: rankings may be displayed with their attribution (14 October 2026).</w:t>
       </w:r>
     </w:p>
     <w:p>
@@ -12166,7 +12166,7 @@
         <w:rPr>
           <w:rtl w:val="0"/>
         </w:rPr>
-        <w:t xml:space="preserve"> is a signed link valid for 24 hours; copy to Wix Media at refresh and re-copy when </w:t>
+        <w:t xml:space="preserve"> is a signed link valid for 365 days; copy the file to Wix Media and re-copy when </w:t>
       </w:r>
       <w:r>
         <w:rPr>
@@ -12182,7 +12182,7 @@
         <w:rPr>
           <w:rtl w:val="0"/>
         </w:rPr>
-        <w:t xml:space="preserve"> changes.</w:t>
+        <w:t xml:space="preserve"> changes or when sync sends the logo again with a new link.</w:t>
       </w:r>
     </w:p>
     <w:p>
@@ -12290,7 +12290,307 @@
         <w:rPr>
           <w:rtl w:val="0"/>
         </w:rPr>
-        <w:t xml:space="preserve"> (management_decision_pending until management confirms usage terms).</w:t>
+        <w:t xml:space="preserve"> (approved: logos may be displayed, 14 October 2026).</w:t>
+      </w:r>
+    </w:p>
+    <w:p>
+      <w:pPr>
+        <w:pStyle w:val="Heading2"/>
+      </w:pPr>
+      <w:r>
+        <w:rPr>
+          <w:rtl w:val="0"/>
+        </w:rPr>
+        <w:t xml:space="preserve">13.8 Sync — full load, then only what changed</w:t>
+      </w:r>
+    </w:p>
+    <w:p>
+      <w:pPr/>
+      <w:r>
+        <w:rPr>
+          <w:rtl w:val="0"/>
+        </w:rPr>
+        <w:t xml:space="preserve">Use sync to keep the Wix collections current with the fewest calls. The first call (no cursor, or full_load true) returns every item the API returns, in pages. Each reply carries next_cursor: send it back on the next call. When the full load is finished, the same cursor returns only what changed since: new and changed items, and removals.</w:t>
+      </w:r>
+    </w:p>
+    <w:p>
+      <w:pPr>
+        <w:spacing w:after="0" w:before="0" w:line="276" w:lineRule="auto"/>
+        <w:ind w:left="288" w:right="0" w:firstLine="0"/>
+        <w:jc w:val="left"/>
+        <w:rPr>
+          <w:rFonts w:ascii="Consolas" w:cs="Consolas" w:eastAsia="Consolas" w:hAnsi="Consolas"/>
+          <w:color w:val="000000"/>
+          <w:sz w:val="17"/>
+          <w:szCs w:val="17"/>
+        </w:rPr>
+      </w:pPr>
+      <w:r>
+        <w:rPr>
+          <w:rFonts w:ascii="Consolas" w:cs="Consolas" w:eastAsia="Consolas" w:hAnsi="Consolas"/>
+          <w:color w:val="000000"/>
+          <w:sz w:val="17"/>
+          <w:szCs w:val="17"/>
+          <w:rtl w:val="0"/>
+        </w:rPr>
+        <w:t xml:space="preserve">{</w:t>
+      </w:r>
+    </w:p>
+    <w:p>
+      <w:pPr>
+        <w:spacing w:after="0" w:before="0" w:line="276" w:lineRule="auto"/>
+        <w:ind w:left="288" w:right="0" w:firstLine="0"/>
+        <w:jc w:val="left"/>
+        <w:rPr>
+          <w:rFonts w:ascii="Consolas" w:cs="Consolas" w:eastAsia="Consolas" w:hAnsi="Consolas"/>
+          <w:color w:val="000000"/>
+          <w:sz w:val="17"/>
+          <w:szCs w:val="17"/>
+        </w:rPr>
+      </w:pPr>
+      <w:r>
+        <w:rPr>
+          <w:rFonts w:ascii="Consolas" w:cs="Consolas" w:eastAsia="Consolas" w:hAnsi="Consolas"/>
+          <w:color w:val="000000"/>
+          <w:sz w:val="17"/>
+          <w:szCs w:val="17"/>
+          <w:rtl w:val="0"/>
+        </w:rPr>
+        <w:t xml:space="preserve">  "contract": "website-search-v2",</w:t>
+      </w:r>
+    </w:p>
+    <w:p>
+      <w:pPr>
+        <w:spacing w:after="0" w:before="0" w:line="276" w:lineRule="auto"/>
+        <w:ind w:left="288" w:right="0" w:firstLine="0"/>
+        <w:jc w:val="left"/>
+        <w:rPr>
+          <w:rFonts w:ascii="Consolas" w:cs="Consolas" w:eastAsia="Consolas" w:hAnsi="Consolas"/>
+          <w:color w:val="000000"/>
+          <w:sz w:val="17"/>
+          <w:szCs w:val="17"/>
+        </w:rPr>
+      </w:pPr>
+      <w:r>
+        <w:rPr>
+          <w:rFonts w:ascii="Consolas" w:cs="Consolas" w:eastAsia="Consolas" w:hAnsi="Consolas"/>
+          <w:color w:val="000000"/>
+          <w:sz w:val="17"/>
+          <w:szCs w:val="17"/>
+          <w:rtl w:val="0"/>
+        </w:rPr>
+        <w:t xml:space="preserve">  "action": "sync",</w:t>
+      </w:r>
+    </w:p>
+    <w:p>
+      <w:pPr>
+        <w:spacing w:after="0" w:before="0" w:line="276" w:lineRule="auto"/>
+        <w:ind w:left="288" w:right="0" w:firstLine="0"/>
+        <w:jc w:val="left"/>
+        <w:rPr>
+          <w:rFonts w:ascii="Consolas" w:cs="Consolas" w:eastAsia="Consolas" w:hAnsi="Consolas"/>
+          <w:color w:val="000000"/>
+          <w:sz w:val="17"/>
+          <w:szCs w:val="17"/>
+        </w:rPr>
+      </w:pPr>
+      <w:r>
+        <w:rPr>
+          <w:rFonts w:ascii="Consolas" w:cs="Consolas" w:eastAsia="Consolas" w:hAnsi="Consolas"/>
+          <w:color w:val="000000"/>
+          <w:sz w:val="17"/>
+          <w:szCs w:val="17"/>
+          <w:rtl w:val="0"/>
+        </w:rPr>
+        <w:t xml:space="preserve">  "cursor": "&lt;next_cursor from the last reply; omit for a full load&gt;",</w:t>
+      </w:r>
+    </w:p>
+    <w:p>
+      <w:pPr>
+        <w:spacing w:after="0" w:before="0" w:line="276" w:lineRule="auto"/>
+        <w:ind w:left="288" w:right="0" w:firstLine="0"/>
+        <w:jc w:val="left"/>
+        <w:rPr>
+          <w:rFonts w:ascii="Consolas" w:cs="Consolas" w:eastAsia="Consolas" w:hAnsi="Consolas"/>
+          <w:color w:val="000000"/>
+          <w:sz w:val="17"/>
+          <w:szCs w:val="17"/>
+        </w:rPr>
+      </w:pPr>
+      <w:r>
+        <w:rPr>
+          <w:rFonts w:ascii="Consolas" w:cs="Consolas" w:eastAsia="Consolas" w:hAnsi="Consolas"/>
+          <w:color w:val="000000"/>
+          <w:sz w:val="17"/>
+          <w:szCs w:val="17"/>
+          <w:rtl w:val="0"/>
+        </w:rPr>
+        <w:t xml:space="preserve">  "entities": ["reference", "provider", "logo", "rankings", "scholarship", "course"],</w:t>
+      </w:r>
+    </w:p>
+    <w:p>
+      <w:pPr>
+        <w:spacing w:after="0" w:before="0" w:line="276" w:lineRule="auto"/>
+        <w:ind w:left="288" w:right="0" w:firstLine="0"/>
+        <w:jc w:val="left"/>
+        <w:rPr>
+          <w:rFonts w:ascii="Consolas" w:cs="Consolas" w:eastAsia="Consolas" w:hAnsi="Consolas"/>
+          <w:color w:val="000000"/>
+          <w:sz w:val="17"/>
+          <w:szCs w:val="17"/>
+        </w:rPr>
+      </w:pPr>
+      <w:r>
+        <w:rPr>
+          <w:rFonts w:ascii="Consolas" w:cs="Consolas" w:eastAsia="Consolas" w:hAnsi="Consolas"/>
+          <w:color w:val="000000"/>
+          <w:sz w:val="17"/>
+          <w:szCs w:val="17"/>
+          <w:rtl w:val="0"/>
+        </w:rPr>
+        <w:t xml:space="preserve">  "page_size": 50</w:t>
+      </w:r>
+    </w:p>
+    <w:p>
+      <w:pPr>
+        <w:spacing w:after="0" w:before="0" w:line="276" w:lineRule="auto"/>
+        <w:ind w:left="288" w:right="0" w:firstLine="0"/>
+        <w:jc w:val="left"/>
+        <w:rPr>
+          <w:rFonts w:ascii="Consolas" w:cs="Consolas" w:eastAsia="Consolas" w:hAnsi="Consolas"/>
+          <w:color w:val="000000"/>
+          <w:sz w:val="17"/>
+          <w:szCs w:val="17"/>
+        </w:rPr>
+      </w:pPr>
+      <w:r>
+        <w:rPr>
+          <w:rFonts w:ascii="Consolas" w:cs="Consolas" w:eastAsia="Consolas" w:hAnsi="Consolas"/>
+          <w:color w:val="000000"/>
+          <w:sz w:val="17"/>
+          <w:szCs w:val="17"/>
+          <w:rtl w:val="0"/>
+        </w:rPr>
+        <w:t xml:space="preserve">}</w:t>
+      </w:r>
+    </w:p>
+    <w:p>
+      <w:pPr>
+        <w:numPr>
+          <w:ilvl w:val="0"/>
+          <w:numId w:val="1"/>
+        </w:numPr>
+        <w:spacing w:after="0" w:before="0" w:line="276" w:lineRule="auto"/>
+        <w:ind w:left="360" w:right="0" w:hanging="360"/>
+        <w:jc w:val="left"/>
+      </w:pPr>
+      <w:r>
+        <w:rPr>
+          <w:rtl w:val="0"/>
+        </w:rPr>
+        <w:t xml:space="preserve">Request: cursor (omit or null for a full load), full_load (true starts a full load again), entities (optional; all six by default; a cursor keeps the entities it started with), page_size (50 at most).</w:t>
+      </w:r>
+    </w:p>
+    <w:p>
+      <w:pPr>
+        <w:numPr>
+          <w:ilvl w:val="0"/>
+          <w:numId w:val="1"/>
+        </w:numPr>
+        <w:spacing w:after="0" w:before="0" w:line="276" w:lineRule="auto"/>
+        <w:ind w:left="360" w:right="0" w:hanging="360"/>
+        <w:jc w:val="left"/>
+      </w:pPr>
+      <w:r>
+        <w:rPr>
+          <w:rtl w:val="0"/>
+        </w:rPr>
+        <w:t xml:space="preserve">Reply: items[] { entity, id, seq, change (upsert or remove), item }, has_more, next_cursor, mode (full or delta), full_load_complete (on a full load), checked_through, as_of.</w:t>
+      </w:r>
+    </w:p>
+    <w:p>
+      <w:pPr>
+        <w:numPr>
+          <w:ilvl w:val="0"/>
+          <w:numId w:val="1"/>
+        </w:numPr>
+        <w:spacing w:after="0" w:before="0" w:line="276" w:lineRule="auto"/>
+        <w:ind w:left="360" w:right="0" w:hanging="360"/>
+        <w:jc w:val="left"/>
+      </w:pPr>
+      <w:r>
+        <w:rPr>
+          <w:rtl w:val="0"/>
+        </w:rPr>
+        <w:t xml:space="preserve">Item shapes: course is the search item (CF_Courses, 13.2); provider is the provider detail (13.4); logo is { provider_id, logo } (13.7); rankings is { provider_id, rankings[] } (13.6); scholarship is the scholarship detail (13.5); reference is the reference action.</w:t>
+      </w:r>
+    </w:p>
+    <w:p>
+      <w:pPr>
+        <w:numPr>
+          <w:ilvl w:val="0"/>
+          <w:numId w:val="1"/>
+        </w:numPr>
+        <w:spacing w:after="0" w:before="0" w:line="276" w:lineRule="auto"/>
+        <w:ind w:left="360" w:right="0" w:hanging="360"/>
+        <w:jc w:val="left"/>
+      </w:pPr>
+      <w:r>
+        <w:rPr>
+          <w:rtl w:val="0"/>
+        </w:rPr>
+        <w:t xml:space="preserve">Store next_cursor in CF_SyncState only after the page is written to Wix. If a write fails, send the same cursor again: the same items come back, and an upsert by id makes the replay safe.</w:t>
+      </w:r>
+    </w:p>
+    <w:p>
+      <w:pPr>
+        <w:numPr>
+          <w:ilvl w:val="0"/>
+          <w:numId w:val="1"/>
+        </w:numPr>
+        <w:spacing w:after="0" w:before="0" w:line="276" w:lineRule="auto"/>
+        <w:ind w:left="360" w:right="0" w:hanging="360"/>
+        <w:jc w:val="left"/>
+      </w:pPr>
+      <w:r>
+        <w:rPr>
+          <w:rtl w:val="0"/>
+        </w:rPr>
+        <w:t xml:space="preserve">change remove: delete the record by id (for example a provider switched off, with its courses, or a scholarship no longer published).</w:t>
+      </w:r>
+    </w:p>
+    <w:p>
+      <w:pPr>
+        <w:numPr>
+          <w:ilvl w:val="0"/>
+          <w:numId w:val="1"/>
+        </w:numPr>
+        <w:spacing w:after="0" w:before="0" w:line="276" w:lineRule="auto"/>
+        <w:ind w:left="360" w:right="0" w:hanging="360"/>
+        <w:jc w:val="left"/>
+      </w:pPr>
+      <w:r>
+        <w:rPr>
+          <w:rtl w:val="0"/>
+        </w:rPr>
+        <w:t xml:space="preserve">Freshness: the platform checks items every minute in a rolling pass; a full pass takes about 90 minutes. checked_through is when the last full pass finished (null until the first pass has finished); a change made after it appears in a later delta.</w:t>
+      </w:r>
+    </w:p>
+    <w:p>
+      <w:pPr>
+        <w:numPr>
+          <w:ilvl w:val="0"/>
+          <w:numId w:val="1"/>
+        </w:numPr>
+        <w:spacing w:after="0" w:before="0" w:line="276" w:lineRule="auto"/>
+        <w:ind w:left="360" w:right="0" w:hanging="360"/>
+        <w:jc w:val="left"/>
+      </w:pPr>
+      <w:r>
+        <w:rPr>
+          <w:rtl w:val="0"/>
+        </w:rPr>
+        <w:t xml:space="preserve">Size: a full load is about 40,400 items (14 October 2026), about 810 calls at 50 a page, within the limit of 60 calls a minute.</w:t>
       </w:r>
     </w:p>
     <w:p>
@@ -14676,7 +14976,7 @@
               <w:rPr>
                 <w:rtl w:val="0"/>
               </w:rPr>
-              <w:t xml:space="preserve">Included (13.6). Display is subject to management's decision on usage terms; terms_status shows the position</w:t>
+              <w:t xml:space="preserve">Included (13.6). Approved for display (14 October 2026); show the attribution; terms_status reads approved</w:t>
             </w:r>
           </w:p>
         </w:tc>
@@ -14712,7 +15012,7 @@
               <w:rPr>
                 <w:rtl w:val="0"/>
               </w:rPr>
-              <w:t xml:space="preserve">Included (13.7). Display is subject to management's decision on usage terms; keep the initials fallback for providers without a logo</w:t>
+              <w:t xml:space="preserve">Included (13.7). Approved for display (14 October 2026); keep the initials fallback for providers without a logo</w:t>
             </w:r>
           </w:p>
         </w:tc>
@@ -16322,7 +16622,7 @@
               <w:rPr>
                 <w:rtl w:val="0"/>
               </w:rPr>
-              <w:t xml:space="preserve">providers with has_logo true returns 49 providers whose logo.url opens within 24 hours; the copy in Wix Media is served to visitors</w:t>
+              <w:t xml:space="preserve">providers with has_logo true returns 49 providers whose logo.url opens and whose url_expires_at is about 365 days ahead; the copy in Wix Media is served to visitors</w:t>
             </w:r>
           </w:p>
         </w:tc>
@@ -16425,6 +16725,108 @@
                 <w:rtl w:val="0"/>
               </w:rPr>
               <w:t xml:space="preserve">changed_since with sort updated_asc returns only changed records; replay creates no duplicates</w:t>
+            </w:r>
+          </w:p>
+        </w:tc>
+      </w:tr>
+      <w:tr>
+        <w:trPr>
+          <w:cantSplit w:val="1"/>
+          <w:tblHeader w:val="0"/>
+        </w:trPr>
+        <w:tc>
+          <w:tcPr>
+            <w:tcW w:w="700" w:type="dxa"/>
+            <w:vAlign w:val="center"/>
+          </w:tcPr>
+          <w:p>
+            <w:pPr/>
+            <w:r>
+              <w:rPr>
+                <w:rtl w:val="0"/>
+              </w:rPr>
+              <w:t xml:space="preserve">12a</w:t>
+            </w:r>
+          </w:p>
+        </w:tc>
+        <w:tc>
+          <w:tcPr>
+            <w:tcW w:w="2600" w:type="dxa"/>
+            <w:vAlign w:val="center"/>
+          </w:tcPr>
+          <w:p>
+            <w:pPr/>
+            <w:r>
+              <w:rPr>
+                <w:rtl w:val="0"/>
+              </w:rPr>
+              <w:t xml:space="preserve">Sync full load</w:t>
+            </w:r>
+          </w:p>
+        </w:tc>
+        <w:tc>
+          <w:tcPr>
+            <w:tcW w:w="6924" w:type="dxa"/>
+            <w:vAlign w:val="center"/>
+          </w:tcPr>
+          <w:p>
+            <w:pPr/>
+            <w:r>
+              <w:rPr>
+                <w:rtl w:val="0"/>
+              </w:rPr>
+              <w:t xml:space="preserve">sync with no cursor and page_size 50: mode full, 50 items, has_more true; following next_cursor to the end gives full_load_complete true (about 40,400 items on 14 Oct)</w:t>
+            </w:r>
+          </w:p>
+        </w:tc>
+      </w:tr>
+      <w:tr>
+        <w:trPr>
+          <w:cantSplit w:val="1"/>
+          <w:tblHeader w:val="0"/>
+        </w:trPr>
+        <w:tc>
+          <w:tcPr>
+            <w:tcW w:w="700" w:type="dxa"/>
+            <w:vAlign w:val="center"/>
+          </w:tcPr>
+          <w:p>
+            <w:pPr/>
+            <w:r>
+              <w:rPr>
+                <w:rtl w:val="0"/>
+              </w:rPr>
+              <w:t xml:space="preserve">12b</w:t>
+            </w:r>
+          </w:p>
+        </w:tc>
+        <w:tc>
+          <w:tcPr>
+            <w:tcW w:w="2600" w:type="dxa"/>
+            <w:vAlign w:val="center"/>
+          </w:tcPr>
+          <w:p>
+            <w:pPr/>
+            <w:r>
+              <w:rPr>
+                <w:rtl w:val="0"/>
+              </w:rPr>
+              <w:t xml:space="preserve">Sync changes</w:t>
+            </w:r>
+          </w:p>
+        </w:tc>
+        <w:tc>
+          <w:tcPr>
+            <w:tcW w:w="6924" w:type="dxa"/>
+            <w:vAlign w:val="center"/>
+          </w:tcPr>
+          <w:p>
+            <w:pPr/>
+            <w:r>
+              <w:rPr>
+                <w:rtl w:val="0"/>
+              </w:rPr>
+              <w:t xml:space="preserve">the last next_cursor sent again returns only what changed since (often nothing); a provider switched off comes back as change remove for the provider and its courses</w:t>
             </w:r>
           </w:p>
         </w:tc>
@@ -17171,6 +17573,42 @@
                 <w:rtl w:val="0"/>
               </w:rPr>
               <w:t xml:space="preserve">Two New Zealand course durations that had been read from a fee line were withdrawn (duration_months now null for them; New Zealand total 2,929); durations stated in semesters stay null. No field, filter or action changed</w:t>
+            </w:r>
+          </w:p>
+        </w:tc>
+      </w:tr>
+      <w:tr>
+        <w:trPr>
+          <w:cantSplit w:val="1"/>
+          <w:tblHeader w:val="0"/>
+        </w:trPr>
+        <w:tc>
+          <w:tcPr>
+            <w:tcW w:w="2000" w:type="dxa"/>
+            <w:vAlign w:val="center"/>
+          </w:tcPr>
+          <w:p>
+            <w:pPr/>
+            <w:r>
+              <w:rPr>
+                <w:rtl w:val="0"/>
+              </w:rPr>
+              <w:t xml:space="preserve">14 Oct 2026</w:t>
+            </w:r>
+          </w:p>
+        </w:tc>
+        <w:tc>
+          <w:tcPr>
+            <w:tcW w:w="8224" w:type="dxa"/>
+            <w:vAlign w:val="center"/>
+          </w:tcPr>
+          <w:p>
+            <w:pPr/>
+            <w:r>
+              <w:rPr>
+                <w:rtl w:val="0"/>
+              </w:rPr>
+              <w:t xml:space="preserve">Rankings and logos approved for display (terms_status approved); logo links valid 365 days; new action sync (13.8): a full load in pages, then only what changed, with removals, by a cursor; acceptance tests 12a and 12b; Step B2, section 7 and section 15 updated. Every earlier field, filter and action is unchanged</w:t>
             </w:r>
           </w:p>
         </w:tc>

</xml_diff>